<commit_message>
Update CV without phone number
</commit_message>
<xml_diff>
--- a/assets/resume/Zijue_Chen_CV.docx
+++ b/assets/resume/Zijue_Chen_CV.docx
@@ -1,6 +1,6 @@
 
 <file path=word/document.xml><?xml version="1.0" encoding="utf-8"?>
-<w:document xmlns:wpc="http://schemas.microsoft.com/office/word/2010/wordprocessingCanvas" xmlns:cx="http://schemas.microsoft.com/office/drawing/2014/chartex" xmlns:cx1="http://schemas.microsoft.com/office/drawing/2015/9/8/chartex" xmlns:cx2="http://schemas.microsoft.com/office/drawing/2015/10/21/chartex" xmlns:cx3="http://schemas.microsoft.com/office/drawing/2016/5/9/chartex" xmlns:cx4="http://schemas.microsoft.com/office/drawing/2016/5/10/chartex" xmlns:cx5="http://schemas.microsoft.com/office/drawing/2016/5/11/chartex" xmlns:cx6="http://schemas.microsoft.com/office/drawing/2016/5/12/chartex" xmlns:cx7="http://schemas.microsoft.com/office/drawing/2016/5/13/chartex" xmlns:cx8="http://schemas.microsoft.com/office/drawing/2016/5/14/chartex" xmlns:mc="http://schemas.openxmlformats.org/markup-compatibility/2006" xmlns:aink="http://schemas.microsoft.com/office/drawing/2016/ink" xmlns:am3d="http://schemas.microsoft.com/office/drawing/2017/model3d" xmlns:o="urn:schemas-microsoft-com:office:office" xmlns:oel="http://schemas.microsoft.com/office/2019/extlst" xmlns:r="http://schemas.openxmlformats.org/officeDocument/2006/relationships" xmlns:m="http://schemas.openxmlformats.org/officeDocument/2006/math" xmlns:v="urn:schemas-microsoft-com:vml" xmlns:wp14="http://schemas.microsoft.com/office/word/2010/wordprocessingDrawing" xmlns:wp="http://schemas.openxmlformats.org/drawingml/2006/wordprocessingDrawing" xmlns:w10="urn:schemas-microsoft-com:office:word" xmlns:w="http://schemas.openxmlformats.org/wordprocessingml/2006/main" xmlns:w14="http://schemas.microsoft.com/office/word/2010/wordml" xmlns:w15="http://schemas.microsoft.com/office/word/2012/wordml" xmlns:w16cex="http://schemas.microsoft.com/office/word/2018/wordml/cex" xmlns:w16cid="http://schemas.microsoft.com/office/word/2016/wordml/cid" xmlns:w16="http://schemas.microsoft.com/office/word/2018/wordml" xmlns:w16du="http://schemas.microsoft.com/office/word/2023/wordml/word16du" xmlns:w16sdtdh="http://schemas.microsoft.com/office/word/2020/wordml/sdtdatahash" xmlns:w16sdtfl="http://schemas.microsoft.com/office/word/2024/wordml/sdtformatlock" xmlns:w16se="http://schemas.microsoft.com/office/word/2015/wordml/symex" xmlns:wpg="http://schemas.microsoft.com/office/word/2010/wordprocessingGroup" xmlns:wpi="http://schemas.microsoft.com/office/word/2010/wordprocessingInk" xmlns:wne="http://schemas.microsoft.com/office/word/2006/wordml" xmlns:wps="http://schemas.microsoft.com/office/word/2010/wordprocessingShape" mc:Ignorable="w14 w15 w16se w16cid w16 w16cex w16sdtdh w16sdtfl w16du wp14">
+<w:document xmlns:wpc="http://schemas.microsoft.com/office/word/2010/wordprocessingCanvas" xmlns:cx="http://schemas.microsoft.com/office/drawing/2014/chartex" xmlns:cx1="http://schemas.microsoft.com/office/drawing/2015/9/8/chartex" xmlns:cx2="http://schemas.microsoft.com/office/drawing/2015/10/21/chartex" xmlns:cx3="http://schemas.microsoft.com/office/drawing/2016/5/9/chartex" xmlns:cx4="http://schemas.microsoft.com/office/drawing/2016/5/10/chartex" xmlns:cx5="http://schemas.microsoft.com/office/drawing/2016/5/11/chartex" xmlns:cx6="http://schemas.microsoft.com/office/drawing/2016/5/12/chartex" xmlns:cx7="http://schemas.microsoft.com/office/drawing/2016/5/13/chartex" xmlns:cx8="http://schemas.microsoft.com/office/drawing/2016/5/14/chartex" xmlns:mc="http://schemas.openxmlformats.org/markup-compatibility/2006" xmlns:aink="http://schemas.microsoft.com/office/drawing/2016/ink" xmlns:am3d="http://schemas.microsoft.com/office/drawing/2017/model3d" xmlns:o="urn:schemas-microsoft-com:office:office" xmlns:oel="http://schemas.microsoft.com/office/2019/extlst" xmlns:r="http://schemas.openxmlformats.org/officeDocument/2006/relationships" xmlns:m="http://schemas.openxmlformats.org/officeDocument/2006/math" xmlns:v="urn:schemas-microsoft-com:vml" xmlns:wp14="http://schemas.microsoft.com/office/word/2010/wordprocessingDrawing" xmlns:wp="http://schemas.openxmlformats.org/drawingml/2006/wordprocessingDrawing" xmlns:w10="urn:schemas-microsoft-com:office:word" xmlns:w="http://schemas.openxmlformats.org/wordprocessingml/2006/main" xmlns:w14="http://schemas.microsoft.com/office/word/2010/wordml" xmlns:w15="http://schemas.microsoft.com/office/word/2012/wordml" xmlns:w16cei="http://schemas.microsoft.com/office/word/2026/wordml/cei" xmlns:w16cex="http://schemas.microsoft.com/office/word/2018/wordml/cex" xmlns:w16cid="http://schemas.microsoft.com/office/word/2016/wordml/cid" xmlns:w16="http://schemas.microsoft.com/office/word/2018/wordml" xmlns:w16du="http://schemas.microsoft.com/office/word/2023/wordml/word16du" xmlns:w16sdtdh="http://schemas.microsoft.com/office/word/2020/wordml/sdtdatahash" xmlns:w16sdtfl="http://schemas.microsoft.com/office/word/2024/wordml/sdtformatlock" xmlns:w16se="http://schemas.microsoft.com/office/word/2015/wordml/symex" xmlns:wpg="http://schemas.microsoft.com/office/word/2010/wordprocessingGroup" xmlns:wpi="http://schemas.microsoft.com/office/word/2010/wordprocessingInk" xmlns:wne="http://schemas.microsoft.com/office/word/2006/wordml" xmlns:wps="http://schemas.microsoft.com/office/word/2010/wordprocessingShape" mc:Ignorable="w14 w15 w16se w16cid w16 w16cex w16sdtdh w16sdtfl w16du wp14">
   <w:body>
     <w:p>
       <w:pPr>
@@ -51,7 +51,7 @@
           <w:szCs w:val="20"/>
           <w:lang w:val="en-AU"/>
         </w:rPr>
-        <w:t>Melbourne, Australia | 0452 180 918 | zijuechen.36@gmail.com</w:t>
+        <w:t>Melbourne, Australia | zijuechen.36@gmail.com</w:t>
       </w:r>
     </w:p>
     <w:p>
@@ -90,27 +90,7 @@
           <w:szCs w:val="20"/>
           <w:lang w:val="en-AU"/>
         </w:rPr>
-        <w:t xml:space="preserve">Passionate researcher and educator working at the intersection of AI, automation, robotics, and smart </w:t>
-      </w:r>
-      <w:proofErr w:type="spellStart"/>
-      <w:r>
-        <w:rPr>
-          <w:rFonts w:ascii="Times New Roman" w:hAnsi="Times New Roman" w:cs="Times New Roman"/>
-          <w:sz w:val="20"/>
-          <w:szCs w:val="20"/>
-          <w:lang w:val="en-AU"/>
-        </w:rPr>
-        <w:t>manufacturing,</w:t>
-      </w:r>
-      <w:proofErr w:type="spellEnd"/>
-      <w:r>
-        <w:rPr>
-          <w:rFonts w:ascii="Times New Roman" w:hAnsi="Times New Roman" w:cs="Times New Roman"/>
-          <w:sz w:val="20"/>
-          <w:szCs w:val="20"/>
-          <w:lang w:val="en-AU"/>
-        </w:rPr>
-        <w:t xml:space="preserve"> with a particular focus on developing data-efficient and deployable AI solutions for real-world engineering systems. Particularly interested in engineering problems where intelligent sensing, monitoring, control, and decision-making must be tightly integrated into physical systems. Strongly committed to advancing practical, industry-relevant research and to equipping the next generation of engineers to harness AI tools with confidence and purpose.</w:t>
+        <w:t>Passionate researcher and educator working at the intersection of AI, automation, robotics, and smart manufacturing, with a particular focus on developing data-efficient and deployable AI solutions for real-world engineering systems. Particularly interested in engineering problems where intelligent sensing, monitoring, control, and decision-making must be tightly integrated into physical systems. Strongly committed to advancing practical, industry-relevant research and to equipping the next generation of engineers to harness AI tools with confidence and purpose.</w:t>
       </w:r>
     </w:p>
     <w:p>
@@ -324,47 +304,7 @@
           <w:szCs w:val="20"/>
           <w:lang w:eastAsia="zh-CN"/>
         </w:rPr>
-        <w:t xml:space="preserve">Smart </w:t>
-      </w:r>
-      <w:proofErr w:type="spellStart"/>
-      <w:r>
-        <w:rPr>
-          <w:rFonts w:ascii="Times New Roman" w:hAnsi="Times New Roman" w:cs="Times New Roman"/>
-          <w:sz w:val="20"/>
-          <w:szCs w:val="20"/>
-          <w:lang w:eastAsia="zh-CN"/>
-        </w:rPr>
-        <w:t>manufacturing,</w:t>
-      </w:r>
-      <w:proofErr w:type="spellEnd"/>
-      <w:r>
-        <w:rPr>
-          <w:rFonts w:ascii="Times New Roman" w:hAnsi="Times New Roman" w:cs="Times New Roman"/>
-          <w:sz w:val="20"/>
-          <w:szCs w:val="20"/>
-          <w:lang w:eastAsia="zh-CN"/>
-        </w:rPr>
-        <w:t xml:space="preserve"> digital twins, process </w:t>
-      </w:r>
-      <w:proofErr w:type="spellStart"/>
-      <w:r>
-        <w:rPr>
-          <w:rFonts w:ascii="Times New Roman" w:hAnsi="Times New Roman" w:cs="Times New Roman"/>
-          <w:sz w:val="20"/>
-          <w:szCs w:val="20"/>
-          <w:lang w:eastAsia="zh-CN"/>
-        </w:rPr>
-        <w:t>optimisation</w:t>
-      </w:r>
-      <w:proofErr w:type="spellEnd"/>
-      <w:r>
-        <w:rPr>
-          <w:rFonts w:ascii="Times New Roman" w:hAnsi="Times New Roman" w:cs="Times New Roman"/>
-          <w:sz w:val="20"/>
-          <w:szCs w:val="20"/>
-          <w:lang w:eastAsia="zh-CN"/>
-        </w:rPr>
-        <w:t>, directed energy deposition (DED), laser powder bed fusion (LPBF)</w:t>
+        <w:t>Smart manufacturing, digital twins, process optimisation, directed energy deposition (DED), laser powder bed fusion (LPBF)</w:t>
       </w:r>
     </w:p>
     <w:p>
@@ -1529,27 +1469,7 @@
           <w:szCs w:val="20"/>
           <w:lang w:val="en-AU"/>
         </w:rPr>
-        <w:t xml:space="preserve">Lead research on data-efficient and deployable AI methods for additive </w:t>
-      </w:r>
-      <w:proofErr w:type="spellStart"/>
-      <w:r>
-        <w:rPr>
-          <w:rFonts w:ascii="Times New Roman" w:hAnsi="Times New Roman" w:cs="Times New Roman"/>
-          <w:sz w:val="20"/>
-          <w:szCs w:val="20"/>
-          <w:lang w:val="en-AU"/>
-        </w:rPr>
-        <w:t>manufacturing,</w:t>
-      </w:r>
-      <w:proofErr w:type="spellEnd"/>
-      <w:r>
-        <w:rPr>
-          <w:rFonts w:ascii="Times New Roman" w:hAnsi="Times New Roman" w:cs="Times New Roman"/>
-          <w:sz w:val="20"/>
-          <w:szCs w:val="20"/>
-          <w:lang w:val="en-AU"/>
-        </w:rPr>
-        <w:t xml:space="preserve"> with a focus on process-condition drift adaptation, melt-pool representation learning, and real-time decision support for future closed-loop control. </w:t>
+        <w:t xml:space="preserve">Lead research on data-efficient and deployable AI methods for additive manufacturing, with a focus on process-condition drift adaptation, melt-pool representation learning, and real-time decision support for future closed-loop control. </w:t>
       </w:r>
     </w:p>
     <w:p>
@@ -1789,27 +1709,7 @@
           <w:szCs w:val="20"/>
           <w:lang w:val="en-AU"/>
         </w:rPr>
-        <w:t xml:space="preserve">Supervised more than 30 final-year, Master’s, and PhD students across machine vision, additive </w:t>
-      </w:r>
-      <w:proofErr w:type="spellStart"/>
-      <w:r>
-        <w:rPr>
-          <w:rFonts w:ascii="Times New Roman" w:hAnsi="Times New Roman" w:cs="Times New Roman"/>
-          <w:sz w:val="20"/>
-          <w:szCs w:val="20"/>
-          <w:lang w:val="en-AU"/>
-        </w:rPr>
-        <w:t>manufacturing,</w:t>
-      </w:r>
-      <w:proofErr w:type="spellEnd"/>
-      <w:r>
-        <w:rPr>
-          <w:rFonts w:ascii="Times New Roman" w:hAnsi="Times New Roman" w:cs="Times New Roman"/>
-          <w:sz w:val="20"/>
-          <w:szCs w:val="20"/>
-          <w:lang w:val="en-AU"/>
-        </w:rPr>
-        <w:t xml:space="preserve"> and smart manufacturing projects. </w:t>
+        <w:t xml:space="preserve">Supervised more than 30 final-year, Master’s, and PhD students across machine vision, additive manufacturing, and smart manufacturing projects. </w:t>
       </w:r>
     </w:p>
     <w:p>
@@ -1867,27 +1767,7 @@
           <w:szCs w:val="20"/>
           <w:lang w:val="en-AU"/>
         </w:rPr>
-        <w:t xml:space="preserve">Conducted research on deep learning, computer vision, and digital-twin applications for additive </w:t>
-      </w:r>
-      <w:proofErr w:type="spellStart"/>
-      <w:r>
-        <w:rPr>
-          <w:rFonts w:ascii="Times New Roman" w:hAnsi="Times New Roman" w:cs="Times New Roman"/>
-          <w:sz w:val="20"/>
-          <w:szCs w:val="20"/>
-          <w:lang w:val="en-AU"/>
-        </w:rPr>
-        <w:t>manufacturing,</w:t>
-      </w:r>
-      <w:proofErr w:type="spellEnd"/>
-      <w:r>
-        <w:rPr>
-          <w:rFonts w:ascii="Times New Roman" w:hAnsi="Times New Roman" w:cs="Times New Roman"/>
-          <w:sz w:val="20"/>
-          <w:szCs w:val="20"/>
-          <w:lang w:val="en-AU"/>
-        </w:rPr>
-        <w:t xml:space="preserve"> including in-situ monitoring, defect detection, warping prediction, and process optimisation. </w:t>
+        <w:t xml:space="preserve">Conducted research on deep learning, computer vision, and digital-twin applications for additive manufacturing, including in-situ monitoring, defect detection, warping prediction, and process optimisation. </w:t>
       </w:r>
     </w:p>
     <w:p>
@@ -1917,27 +1797,7 @@
           <w:szCs w:val="20"/>
           <w:lang w:val="en-AU"/>
         </w:rPr>
-        <w:t xml:space="preserve">Contributed to industry-engaged research and project development with partners including KUKA, Hexagon, and </w:t>
-      </w:r>
-      <w:proofErr w:type="spellStart"/>
-      <w:r>
-        <w:rPr>
-          <w:rFonts w:ascii="Times New Roman" w:hAnsi="Times New Roman" w:cs="Times New Roman"/>
-          <w:sz w:val="20"/>
-          <w:szCs w:val="20"/>
-          <w:lang w:val="en-AU"/>
-        </w:rPr>
-        <w:t>InfraBuild</w:t>
-      </w:r>
-      <w:proofErr w:type="spellEnd"/>
-      <w:r>
-        <w:rPr>
-          <w:rFonts w:ascii="Times New Roman" w:hAnsi="Times New Roman" w:cs="Times New Roman"/>
-          <w:sz w:val="20"/>
-          <w:szCs w:val="20"/>
-          <w:lang w:val="en-AU"/>
-        </w:rPr>
-        <w:t>, supporting the translation of smart manufacturing and automation research into applied engineering contexts.</w:t>
+        <w:t>Contributed to industry-engaged research and project development with partners including KUKA, Hexagon, and InfraBuild, supporting the translation of smart manufacturing and automation research into applied engineering contexts.</w:t>
       </w:r>
     </w:p>
     <w:p>
@@ -2212,31 +2072,7 @@
           <w:szCs w:val="20"/>
           <w:lang w:val="en-AU"/>
         </w:rPr>
-        <w:t xml:space="preserve">ARC </w:t>
-      </w:r>
-      <w:proofErr w:type="spellStart"/>
-      <w:r>
-        <w:rPr>
-          <w:rFonts w:ascii="Times New Roman" w:hAnsi="Times New Roman" w:cs="Times New Roman"/>
-          <w:b/>
-          <w:bCs/>
-          <w:sz w:val="20"/>
-          <w:szCs w:val="20"/>
-          <w:lang w:val="en-AU"/>
-        </w:rPr>
-        <w:t>Nanocomm</w:t>
-      </w:r>
-      <w:proofErr w:type="spellEnd"/>
-      <w:r>
-        <w:rPr>
-          <w:rFonts w:ascii="Times New Roman" w:hAnsi="Times New Roman" w:cs="Times New Roman"/>
-          <w:b/>
-          <w:bCs/>
-          <w:sz w:val="20"/>
-          <w:szCs w:val="20"/>
-          <w:lang w:val="en-AU"/>
-        </w:rPr>
-        <w:t xml:space="preserve"> Hub, </w:t>
+        <w:t xml:space="preserve">ARC Nanocomm Hub, </w:t>
       </w:r>
       <w:r>
         <w:rPr>
@@ -3069,35 +2905,15 @@
           <w:sz w:val="20"/>
           <w:szCs w:val="20"/>
         </w:rPr>
-        <w:t xml:space="preserve">Journal of Manufacturing </w:t>
-      </w:r>
-      <w:proofErr w:type="gramStart"/>
-      <w:r>
-        <w:rPr>
-          <w:rFonts w:ascii="Times New Roman" w:hAnsi="Times New Roman" w:cs="Times New Roman"/>
-          <w:i/>
-          <w:iCs/>
-          <w:sz w:val="20"/>
-          <w:szCs w:val="20"/>
-        </w:rPr>
-        <w:t>Systems</w:t>
-      </w:r>
-      <w:r>
-        <w:rPr>
-          <w:rFonts w:ascii="Times New Roman" w:hAnsi="Times New Roman" w:cs="Times New Roman"/>
-          <w:sz w:val="20"/>
-          <w:szCs w:val="20"/>
-        </w:rPr>
-        <w:t>, and</w:t>
-      </w:r>
-      <w:proofErr w:type="gramEnd"/>
-      <w:r>
-        <w:rPr>
-          <w:rFonts w:ascii="Times New Roman" w:hAnsi="Times New Roman" w:cs="Times New Roman"/>
-          <w:sz w:val="20"/>
-          <w:szCs w:val="20"/>
-        </w:rPr>
-        <w:t xml:space="preserve"> developed a strong practical view of digital twins as systems that should grow deliberately from minimal viable bi-directional information flow, with functionality added incrementally according to required decisions, enabling predictions, available data, and real process constraints.</w:t>
+        <w:t>Journal of Manufacturing Systems</w:t>
+      </w:r>
+      <w:r>
+        <w:rPr>
+          <w:rFonts w:ascii="Times New Roman" w:hAnsi="Times New Roman" w:cs="Times New Roman"/>
+          <w:sz w:val="20"/>
+          <w:szCs w:val="20"/>
+        </w:rPr>
+        <w:t>, and developed a strong practical view of digital twins as systems that should grow deliberately from minimal viable bi-directional information flow, with functionality added incrementally according to required decisions, enabling predictions, available data, and real process constraints.</w:t>
       </w:r>
     </w:p>
     <w:p>
@@ -3323,25 +3139,7 @@
           <w:sz w:val="20"/>
           <w:szCs w:val="20"/>
         </w:rPr>
-        <w:t xml:space="preserve">contributed to additional work on reducing semantic-labelling effort through iterative training and </w:t>
-      </w:r>
-      <w:proofErr w:type="spellStart"/>
-      <w:r>
-        <w:rPr>
-          <w:rFonts w:ascii="Times New Roman" w:hAnsi="Times New Roman" w:cs="Times New Roman"/>
-          <w:sz w:val="20"/>
-          <w:szCs w:val="20"/>
-        </w:rPr>
-        <w:t>optimisation</w:t>
-      </w:r>
-      <w:proofErr w:type="spellEnd"/>
-      <w:r>
-        <w:rPr>
-          <w:rFonts w:ascii="Times New Roman" w:hAnsi="Times New Roman" w:cs="Times New Roman"/>
-          <w:sz w:val="20"/>
-          <w:szCs w:val="20"/>
-        </w:rPr>
-        <w:t xml:space="preserve"> strategies.</w:t>
+        <w:t>contributed to additional work on reducing semantic-labelling effort through iterative training and optimisation strategies.</w:t>
       </w:r>
     </w:p>
     <w:p>
@@ -3593,27 +3391,7 @@
           <w:szCs w:val="20"/>
           <w:lang w:val="en-AU"/>
         </w:rPr>
-        <w:t xml:space="preserve">Developed a coordination mechanism that allowed four prosthetic fingers to close to different extents while naturally balancing grasp force across </w:t>
-      </w:r>
-      <w:proofErr w:type="gramStart"/>
-      <w:r>
-        <w:rPr>
-          <w:rFonts w:ascii="Times New Roman" w:hAnsi="Times New Roman" w:cs="Times New Roman"/>
-          <w:sz w:val="20"/>
-          <w:szCs w:val="20"/>
-          <w:lang w:val="en-AU"/>
-        </w:rPr>
-        <w:t>digits, and</w:t>
-      </w:r>
-      <w:proofErr w:type="gramEnd"/>
-      <w:r>
-        <w:rPr>
-          <w:rFonts w:ascii="Times New Roman" w:hAnsi="Times New Roman" w:cs="Times New Roman"/>
-          <w:sz w:val="20"/>
-          <w:szCs w:val="20"/>
-          <w:lang w:val="en-AU"/>
-        </w:rPr>
-        <w:t xml:space="preserve"> introduced a hybrid TPU–silicone finger structure to mimic the roles of skeletal support and soft tissue deformation, substantially improving grip adaptability and friction. </w:t>
+        <w:t xml:space="preserve">Developed a coordination mechanism that allowed four prosthetic fingers to close to different extents while naturally balancing grasp force across digits, and introduced a hybrid TPU–silicone finger structure to mimic the roles of skeletal support and soft tissue deformation, substantially improving grip adaptability and friction. </w:t>
       </w:r>
     </w:p>
     <w:p>
@@ -3758,25 +3536,7 @@
           <w:sz w:val="20"/>
           <w:szCs w:val="20"/>
         </w:rPr>
-        <w:t xml:space="preserve">, Wang, H., &amp; Gunasegaram, D. (2025). </w:t>
-      </w:r>
-      <w:proofErr w:type="spellStart"/>
-      <w:r>
-        <w:rPr>
-          <w:rFonts w:ascii="Times New Roman" w:hAnsi="Times New Roman" w:cs="Times New Roman"/>
-          <w:sz w:val="20"/>
-          <w:szCs w:val="20"/>
-        </w:rPr>
-        <w:t>MeltpoolEmbedder</w:t>
-      </w:r>
-      <w:proofErr w:type="spellEnd"/>
-      <w:r>
-        <w:rPr>
-          <w:rFonts w:ascii="Times New Roman" w:hAnsi="Times New Roman" w:cs="Times New Roman"/>
-          <w:sz w:val="20"/>
-          <w:szCs w:val="20"/>
-        </w:rPr>
-        <w:t>: An information-rich, orientation-invariant deep learning framework for efficient melt pool feature extraction in metal additive manufacturing. </w:t>
+        <w:t>, Wang, H., &amp; Gunasegaram, D. (2025). MeltpoolEmbedder: An information-rich, orientation-invariant deep learning framework for efficient melt pool feature extraction in metal additive manufacturing. </w:t>
       </w:r>
       <w:r>
         <w:rPr>
@@ -3909,47 +3669,7 @@
           <w:szCs w:val="20"/>
           <w:lang w:val="en-AU"/>
         </w:rPr>
-        <w:t xml:space="preserve">, </w:t>
-      </w:r>
-      <w:proofErr w:type="spellStart"/>
-      <w:r>
-        <w:rPr>
-          <w:rFonts w:ascii="Times New Roman" w:hAnsi="Times New Roman" w:cs="Times New Roman"/>
-          <w:sz w:val="20"/>
-          <w:szCs w:val="20"/>
-          <w:lang w:val="en-AU"/>
-        </w:rPr>
-        <w:t>Surendraarcharyagie</w:t>
-      </w:r>
-      <w:proofErr w:type="spellEnd"/>
-      <w:r>
-        <w:rPr>
-          <w:rFonts w:ascii="Times New Roman" w:hAnsi="Times New Roman" w:cs="Times New Roman"/>
-          <w:sz w:val="20"/>
-          <w:szCs w:val="20"/>
-          <w:lang w:val="en-AU"/>
-        </w:rPr>
-        <w:t xml:space="preserve">, K., </w:t>
-      </w:r>
-      <w:proofErr w:type="spellStart"/>
-      <w:r>
-        <w:rPr>
-          <w:rFonts w:ascii="Times New Roman" w:hAnsi="Times New Roman" w:cs="Times New Roman"/>
-          <w:sz w:val="20"/>
-          <w:szCs w:val="20"/>
-          <w:lang w:val="en-AU"/>
-        </w:rPr>
-        <w:t>Granland</w:t>
-      </w:r>
-      <w:proofErr w:type="spellEnd"/>
-      <w:r>
-        <w:rPr>
-          <w:rFonts w:ascii="Times New Roman" w:hAnsi="Times New Roman" w:cs="Times New Roman"/>
-          <w:sz w:val="20"/>
-          <w:szCs w:val="20"/>
-          <w:lang w:val="en-AU"/>
-        </w:rPr>
-        <w:t xml:space="preserve">, K., Chen, C., Xu, X., Xiong, Y., ... &amp; Tang, Y. (2024). </w:t>
+        <w:t xml:space="preserve">, Surendraarcharyagie, K., Granland, K., Chen, C., Xu, X., Xiong, Y., ... &amp; Tang, Y. (2024). </w:t>
       </w:r>
       <w:r>
         <w:rPr>
@@ -3999,47 +3719,7 @@
           <w:szCs w:val="20"/>
           <w:lang w:val="en-AU"/>
         </w:rPr>
-        <w:t xml:space="preserve">, </w:t>
-      </w:r>
-      <w:proofErr w:type="spellStart"/>
-      <w:r>
-        <w:rPr>
-          <w:rFonts w:ascii="Times New Roman" w:hAnsi="Times New Roman" w:cs="Times New Roman"/>
-          <w:sz w:val="20"/>
-          <w:szCs w:val="20"/>
-          <w:lang w:val="en-AU"/>
-        </w:rPr>
-        <w:t>Granland</w:t>
-      </w:r>
-      <w:proofErr w:type="spellEnd"/>
-      <w:r>
-        <w:rPr>
-          <w:rFonts w:ascii="Times New Roman" w:hAnsi="Times New Roman" w:cs="Times New Roman"/>
-          <w:sz w:val="20"/>
-          <w:szCs w:val="20"/>
-          <w:lang w:val="en-AU"/>
-        </w:rPr>
-        <w:t xml:space="preserve">, K., Tang, Y., &amp; Chen, C. (2024). HOB-CNNv2: Deep </w:t>
-      </w:r>
-      <w:proofErr w:type="gramStart"/>
-      <w:r>
-        <w:rPr>
-          <w:rFonts w:ascii="Times New Roman" w:hAnsi="Times New Roman" w:cs="Times New Roman"/>
-          <w:sz w:val="20"/>
-          <w:szCs w:val="20"/>
-          <w:lang w:val="en-AU"/>
-        </w:rPr>
-        <w:t>learning based</w:t>
-      </w:r>
-      <w:proofErr w:type="gramEnd"/>
-      <w:r>
-        <w:rPr>
-          <w:rFonts w:ascii="Times New Roman" w:hAnsi="Times New Roman" w:cs="Times New Roman"/>
-          <w:sz w:val="20"/>
-          <w:szCs w:val="20"/>
-          <w:lang w:val="en-AU"/>
-        </w:rPr>
-        <w:t xml:space="preserve"> detection of extremely occluded tree branches and reference to the dominant tree image. Computers and Electronics in Agriculture, 218, 108727.</w:t>
+        <w:t>, Granland, K., Tang, Y., &amp; Chen, C. (2024). HOB-CNNv2: Deep learning based detection of extremely occluded tree branches and reference to the dominant tree image. Computers and Electronics in Agriculture, 218, 108727.</w:t>
       </w:r>
     </w:p>
     <w:p>
@@ -4086,25 +3766,7 @@
           <w:sz w:val="20"/>
           <w:szCs w:val="20"/>
         </w:rPr>
-        <w:t xml:space="preserve">, Zhu, Y., </w:t>
-      </w:r>
-      <w:proofErr w:type="spellStart"/>
-      <w:r>
-        <w:rPr>
-          <w:rFonts w:ascii="Times New Roman" w:hAnsi="Times New Roman" w:cs="Times New Roman"/>
-          <w:sz w:val="20"/>
-          <w:szCs w:val="20"/>
-        </w:rPr>
-        <w:t>Gresil</w:t>
-      </w:r>
-      <w:proofErr w:type="spellEnd"/>
-      <w:r>
-        <w:rPr>
-          <w:rFonts w:ascii="Times New Roman" w:hAnsi="Times New Roman" w:cs="Times New Roman"/>
-          <w:sz w:val="20"/>
-          <w:szCs w:val="20"/>
-        </w:rPr>
-        <w:t>, M., &amp; Tang, Y. (2025). Bio-inspired perturbated hierarchical mechanical metamaterial for energy absorption. </w:t>
+        <w:t>, Zhu, Y., Gresil, M., &amp; Tang, Y. (2025). Bio-inspired perturbated hierarchical mechanical metamaterial for energy absorption. </w:t>
       </w:r>
       <w:r>
         <w:rPr>
@@ -4163,27 +3825,7 @@
           <w:szCs w:val="20"/>
           <w:lang w:val="en-AU"/>
         </w:rPr>
-        <w:t xml:space="preserve">, Zhang, Z., </w:t>
-      </w:r>
-      <w:proofErr w:type="spellStart"/>
-      <w:r>
-        <w:rPr>
-          <w:rFonts w:ascii="Times New Roman" w:hAnsi="Times New Roman" w:cs="Times New Roman"/>
-          <w:sz w:val="20"/>
-          <w:szCs w:val="20"/>
-          <w:lang w:val="en-AU"/>
-        </w:rPr>
-        <w:t>Granland</w:t>
-      </w:r>
-      <w:proofErr w:type="spellEnd"/>
-      <w:r>
-        <w:rPr>
-          <w:rFonts w:ascii="Times New Roman" w:hAnsi="Times New Roman" w:cs="Times New Roman"/>
-          <w:sz w:val="20"/>
-          <w:szCs w:val="20"/>
-          <w:lang w:val="en-AU"/>
-        </w:rPr>
-        <w:t>, K., Chen, C., &amp; Tang, Y. (2023). Exploring Optimal Adaptive Process Parameters for Curved Infill Paths of Additive Manufactured Carbon Fibre Reinforced Polymers. Composites Communications, 39, 101549.</w:t>
+        <w:t>, Zhang, Z., Granland, K., Chen, C., &amp; Tang, Y. (2023). Exploring Optimal Adaptive Process Parameters for Curved Infill Paths of Additive Manufactured Carbon Fibre Reinforced Polymers. Composites Communications, 39, 101549.</w:t>
       </w:r>
     </w:p>
     <w:p>
@@ -4222,43 +3864,7 @@
           <w:sz w:val="20"/>
           <w:szCs w:val="20"/>
         </w:rPr>
-        <w:t xml:space="preserve">, Santhakumar, P., </w:t>
-      </w:r>
-      <w:proofErr w:type="spellStart"/>
-      <w:r>
-        <w:rPr>
-          <w:rFonts w:ascii="Times New Roman" w:hAnsi="Times New Roman" w:cs="Times New Roman"/>
-          <w:sz w:val="20"/>
-          <w:szCs w:val="20"/>
-        </w:rPr>
-        <w:t>Granland</w:t>
-      </w:r>
-      <w:proofErr w:type="spellEnd"/>
-      <w:r>
-        <w:rPr>
-          <w:rFonts w:ascii="Times New Roman" w:hAnsi="Times New Roman" w:cs="Times New Roman"/>
-          <w:sz w:val="20"/>
-          <w:szCs w:val="20"/>
-        </w:rPr>
-        <w:t xml:space="preserve">, K., </w:t>
-      </w:r>
-      <w:proofErr w:type="spellStart"/>
-      <w:r>
-        <w:rPr>
-          <w:rFonts w:ascii="Times New Roman" w:hAnsi="Times New Roman" w:cs="Times New Roman"/>
-          <w:sz w:val="20"/>
-          <w:szCs w:val="20"/>
-        </w:rPr>
-        <w:t>Troeung</w:t>
-      </w:r>
-      <w:proofErr w:type="spellEnd"/>
-      <w:r>
-        <w:rPr>
-          <w:rFonts w:ascii="Times New Roman" w:hAnsi="Times New Roman" w:cs="Times New Roman"/>
-          <w:sz w:val="20"/>
-          <w:szCs w:val="20"/>
-        </w:rPr>
-        <w:t>, C., Chen, C., &amp; Tang, Y. (2023, August). Predicting Future Warping from the First Layer: A vision-based deep learning method for 3D Printing Monitoring. In </w:t>
+        <w:t>, Santhakumar, P., Granland, K., Troeung, C., Chen, C., &amp; Tang, Y. (2023, August). Predicting Future Warping from the First Layer: A vision-based deep learning method for 3D Printing Monitoring. In </w:t>
       </w:r>
       <w:r>
         <w:rPr>
@@ -4317,27 +3923,7 @@
           <w:szCs w:val="20"/>
           <w:lang w:val="en-AU"/>
         </w:rPr>
-        <w:t xml:space="preserve">, </w:t>
-      </w:r>
-      <w:proofErr w:type="spellStart"/>
-      <w:r>
-        <w:rPr>
-          <w:rFonts w:ascii="Times New Roman" w:hAnsi="Times New Roman" w:cs="Times New Roman"/>
-          <w:sz w:val="20"/>
-          <w:szCs w:val="20"/>
-          <w:lang w:val="en-AU"/>
-        </w:rPr>
-        <w:t>Granland</w:t>
-      </w:r>
-      <w:proofErr w:type="spellEnd"/>
-      <w:r>
-        <w:rPr>
-          <w:rFonts w:ascii="Times New Roman" w:hAnsi="Times New Roman" w:cs="Times New Roman"/>
-          <w:sz w:val="20"/>
-          <w:szCs w:val="20"/>
-          <w:lang w:val="en-AU"/>
-        </w:rPr>
-        <w:t>, K., Newbury, R., &amp; Chen, C. (2022). HOB-CNN: Hallucination of Occluded Branches with a Convolutional Neural Network for 2D Fruit Trees. Smart Agricultural Technology, 100096.</w:t>
+        <w:t>, Granland, K., Newbury, R., &amp; Chen, C. (2022). HOB-CNN: Hallucination of Occluded Branches with a Convolutional Neural Network for 2D Fruit Trees. Smart Agricultural Technology, 100096.</w:t>
       </w:r>
     </w:p>
     <w:p>
@@ -4401,25 +3987,14 @@
           <w:lang w:val="en-AU"/>
         </w:rPr>
       </w:pPr>
-      <w:proofErr w:type="spellStart"/>
-      <w:r>
-        <w:rPr>
-          <w:rFonts w:ascii="Times New Roman" w:hAnsi="Times New Roman" w:cs="Times New Roman"/>
-          <w:sz w:val="20"/>
-          <w:szCs w:val="20"/>
-          <w:lang w:val="en-AU"/>
-        </w:rPr>
-        <w:t>Granland</w:t>
-      </w:r>
-      <w:proofErr w:type="spellEnd"/>
-      <w:r>
-        <w:rPr>
-          <w:rFonts w:ascii="Times New Roman" w:hAnsi="Times New Roman" w:cs="Times New Roman"/>
-          <w:sz w:val="20"/>
-          <w:szCs w:val="20"/>
-          <w:lang w:val="en-AU"/>
-        </w:rPr>
-        <w:t xml:space="preserve">, K., Newbury, R., </w:t>
+      <w:r>
+        <w:rPr>
+          <w:rFonts w:ascii="Times New Roman" w:hAnsi="Times New Roman" w:cs="Times New Roman"/>
+          <w:sz w:val="20"/>
+          <w:szCs w:val="20"/>
+          <w:lang w:val="en-AU"/>
+        </w:rPr>
+        <w:t xml:space="preserve">Granland, K., Newbury, R., </w:t>
       </w:r>
       <w:r>
         <w:rPr>
@@ -5075,31 +4650,7 @@
           <w:szCs w:val="20"/>
           <w:lang w:val="en-AU"/>
         </w:rPr>
-        <w:t xml:space="preserve">Invited </w:t>
-      </w:r>
-      <w:proofErr w:type="spellStart"/>
-      <w:r>
-        <w:rPr>
-          <w:rFonts w:ascii="Times New Roman" w:hAnsi="Times New Roman" w:cs="Times New Roman"/>
-          <w:b/>
-          <w:bCs/>
-          <w:sz w:val="20"/>
-          <w:szCs w:val="20"/>
-          <w:lang w:val="en-AU"/>
-        </w:rPr>
-        <w:t>Panelist</w:t>
-      </w:r>
-      <w:proofErr w:type="spellEnd"/>
-      <w:r>
-        <w:rPr>
-          <w:rFonts w:ascii="Times New Roman" w:hAnsi="Times New Roman" w:cs="Times New Roman"/>
-          <w:b/>
-          <w:bCs/>
-          <w:sz w:val="20"/>
-          <w:szCs w:val="20"/>
-          <w:lang w:val="en-AU"/>
-        </w:rPr>
-        <w:t xml:space="preserve">, </w:t>
+        <w:t xml:space="preserve">Invited Panelist, </w:t>
       </w:r>
       <w:r>
         <w:rPr>
@@ -5158,31 +4709,7 @@
           <w:szCs w:val="20"/>
           <w:lang w:val="en-AU"/>
         </w:rPr>
-        <w:t xml:space="preserve">Invited </w:t>
-      </w:r>
-      <w:proofErr w:type="spellStart"/>
-      <w:r>
-        <w:rPr>
-          <w:rFonts w:ascii="Times New Roman" w:hAnsi="Times New Roman" w:cs="Times New Roman"/>
-          <w:b/>
-          <w:bCs/>
-          <w:sz w:val="20"/>
-          <w:szCs w:val="20"/>
-          <w:lang w:val="en-AU"/>
-        </w:rPr>
-        <w:t>Panelist</w:t>
-      </w:r>
-      <w:proofErr w:type="spellEnd"/>
-      <w:r>
-        <w:rPr>
-          <w:rFonts w:ascii="Times New Roman" w:hAnsi="Times New Roman" w:cs="Times New Roman"/>
-          <w:b/>
-          <w:bCs/>
-          <w:sz w:val="20"/>
-          <w:szCs w:val="20"/>
-          <w:lang w:val="en-AU"/>
-        </w:rPr>
-        <w:t xml:space="preserve">, </w:t>
+        <w:t xml:space="preserve">Invited Panelist, </w:t>
       </w:r>
       <w:r>
         <w:rPr>
@@ -5394,27 +4921,15 @@
           <w:lang w:val="en-AU"/>
         </w:rPr>
       </w:pPr>
-      <w:proofErr w:type="spellStart"/>
-      <w:r>
-        <w:rPr>
-          <w:rFonts w:ascii="Times New Roman" w:hAnsi="Times New Roman" w:cs="Times New Roman"/>
-          <w:b/>
-          <w:bCs/>
-          <w:sz w:val="20"/>
-          <w:szCs w:val="20"/>
-        </w:rPr>
-        <w:t>Organising</w:t>
-      </w:r>
-      <w:proofErr w:type="spellEnd"/>
-      <w:r>
-        <w:rPr>
-          <w:rFonts w:ascii="Times New Roman" w:hAnsi="Times New Roman" w:cs="Times New Roman"/>
-          <w:b/>
-          <w:bCs/>
-          <w:sz w:val="20"/>
-          <w:szCs w:val="20"/>
-        </w:rPr>
-        <w:t xml:space="preserve"> Committee </w:t>
+      <w:r>
+        <w:rPr>
+          <w:rFonts w:ascii="Times New Roman" w:hAnsi="Times New Roman" w:cs="Times New Roman"/>
+          <w:b/>
+          <w:bCs/>
+          <w:sz w:val="20"/>
+          <w:szCs w:val="20"/>
+        </w:rPr>
+        <w:t xml:space="preserve">Organising Committee </w:t>
       </w:r>
       <w:r>
         <w:rPr>
@@ -5874,25 +5389,7 @@
           <w:sz w:val="20"/>
           <w:szCs w:val="20"/>
         </w:rPr>
-        <w:t xml:space="preserve">Python, PostgreSQL, MATLAB, C, Java; machine learning, computer vision, OpenCV; SolidWorks; industrial robotics (KUKA, Yaskawa </w:t>
-      </w:r>
-      <w:proofErr w:type="spellStart"/>
-      <w:r>
-        <w:rPr>
-          <w:rFonts w:ascii="Times New Roman" w:hAnsi="Times New Roman" w:cs="Times New Roman"/>
-          <w:sz w:val="20"/>
-          <w:szCs w:val="20"/>
-        </w:rPr>
-        <w:t>Motoman</w:t>
-      </w:r>
-      <w:proofErr w:type="spellEnd"/>
-      <w:r>
-        <w:rPr>
-          <w:rFonts w:ascii="Times New Roman" w:hAnsi="Times New Roman" w:cs="Times New Roman"/>
-          <w:sz w:val="20"/>
-          <w:szCs w:val="20"/>
-        </w:rPr>
-        <w:t>, UR5); additive manufacturing (FDM, DED, LPBF).</w:t>
+        <w:t>Python, PostgreSQL, MATLAB, C, Java; machine learning, computer vision, OpenCV; SolidWorks; industrial robotics (KUKA, Yaskawa Motoman, UR5); additive manufacturing (FDM, DED, LPBF).</w:t>
       </w:r>
     </w:p>
     <w:p>
@@ -5954,221 +5451,6 @@
           <w:lang w:eastAsia="zh-CN"/>
         </w:rPr>
         <w:t>.</w:t>
-      </w:r>
-    </w:p>
-    <w:p>
-      <w:pPr>
-        <w:tabs>
-          <w:tab w:val="right" w:pos="10466"/>
-        </w:tabs>
-        <w:spacing w:after="0" w:line="240" w:lineRule="auto"/>
-        <w:jc w:val="both"/>
-        <w:rPr>
-          <w:rFonts w:ascii="Times New Roman" w:hAnsi="Times New Roman" w:cs="Times New Roman"/>
-          <w:sz w:val="20"/>
-          <w:szCs w:val="20"/>
-          <w:lang w:val="en-AU"/>
-        </w:rPr>
-      </w:pPr>
-      <w:r>
-        <w:rPr>
-          <w:rFonts w:ascii="Times New Roman" w:hAnsi="Times New Roman" w:cs="Times New Roman"/>
-          <w:b/>
-          <w:bCs/>
-          <w:sz w:val="20"/>
-          <w:szCs w:val="20"/>
-          <w:lang w:val="en-AU"/>
-        </w:rPr>
-        <w:t>Refere</w:t>
-      </w:r>
-      <w:r>
-        <w:rPr>
-          <w:rFonts w:ascii="Times New Roman" w:hAnsi="Times New Roman" w:cs="Times New Roman"/>
-          <w:b/>
-          <w:bCs/>
-          <w:sz w:val="20"/>
-          <w:szCs w:val="20"/>
-          <w:lang w:val="en-AU"/>
-        </w:rPr>
-        <w:t>e</w:t>
-      </w:r>
-      <w:r>
-        <w:rPr>
-          <w:rFonts w:ascii="Times New Roman" w:hAnsi="Times New Roman" w:cs="Times New Roman"/>
-          <w:b/>
-          <w:bCs/>
-          <w:sz w:val="20"/>
-          <w:szCs w:val="20"/>
-          <w:lang w:val="en-AU"/>
-        </w:rPr>
-        <w:t>s:</w:t>
-      </w:r>
-      <w:r>
-        <w:rPr>
-          <w:rFonts w:ascii="Times New Roman" w:hAnsi="Times New Roman" w:cs="Times New Roman"/>
-          <w:sz w:val="20"/>
-          <w:szCs w:val="20"/>
-          <w:lang w:val="en-AU"/>
-        </w:rPr>
-        <w:t xml:space="preserve"> </w:t>
-      </w:r>
-      <w:r>
-        <w:rPr>
-          <w:rFonts w:ascii="Times New Roman" w:hAnsi="Times New Roman" w:cs="Times New Roman" w:hint="eastAsia"/>
-          <w:sz w:val="20"/>
-          <w:szCs w:val="20"/>
-          <w:lang w:val="en-AU" w:eastAsia="zh-CN"/>
-        </w:rPr>
-        <w:t>Dr Tony Murphy</w:t>
-      </w:r>
-      <w:r>
-        <w:rPr>
-          <w:rFonts w:ascii="Times New Roman" w:hAnsi="Times New Roman" w:cs="Times New Roman"/>
-          <w:sz w:val="20"/>
-          <w:szCs w:val="20"/>
-          <w:lang w:val="en-AU"/>
-        </w:rPr>
-        <w:t xml:space="preserve">, </w:t>
-      </w:r>
-      <w:r>
-        <w:rPr>
-          <w:rFonts w:ascii="Times New Roman" w:hAnsi="Times New Roman" w:cs="Times New Roman" w:hint="eastAsia"/>
-          <w:sz w:val="20"/>
-          <w:szCs w:val="20"/>
-          <w:lang w:val="en-AU" w:eastAsia="zh-CN"/>
-        </w:rPr>
-        <w:t>CSIRO Manufacturing</w:t>
-      </w:r>
-      <w:r>
-        <w:rPr>
-          <w:rFonts w:ascii="Times New Roman" w:hAnsi="Times New Roman" w:cs="Times New Roman"/>
-          <w:sz w:val="20"/>
-          <w:szCs w:val="20"/>
-          <w:lang w:val="en-AU"/>
-        </w:rPr>
-        <w:t xml:space="preserve"> (</w:t>
-      </w:r>
-      <w:r>
-        <w:rPr>
-          <w:rFonts w:ascii="Times New Roman" w:hAnsi="Times New Roman" w:cs="Times New Roman"/>
-          <w:sz w:val="20"/>
-          <w:szCs w:val="20"/>
-          <w:lang w:val="en-AU"/>
-        </w:rPr>
-        <w:t>Tony.Murphy@csiro.au</w:t>
-      </w:r>
-      <w:r>
-        <w:rPr>
-          <w:rFonts w:ascii="Times New Roman" w:hAnsi="Times New Roman" w:cs="Times New Roman"/>
-          <w:sz w:val="20"/>
-          <w:szCs w:val="20"/>
-          <w:lang w:val="en-AU"/>
-        </w:rPr>
-        <w:t xml:space="preserve">); </w:t>
-      </w:r>
-    </w:p>
-    <w:p>
-      <w:pPr>
-        <w:tabs>
-          <w:tab w:val="right" w:pos="10466"/>
-        </w:tabs>
-        <w:spacing w:after="0" w:line="240" w:lineRule="auto"/>
-        <w:jc w:val="both"/>
-        <w:rPr>
-          <w:rFonts w:ascii="Times New Roman" w:hAnsi="Times New Roman" w:cs="Times New Roman"/>
-          <w:sz w:val="20"/>
-          <w:szCs w:val="20"/>
-          <w:lang w:val="en-AU"/>
-        </w:rPr>
-      </w:pPr>
-      <w:r>
-        <w:rPr>
-          <w:rFonts w:ascii="Times New Roman" w:hAnsi="Times New Roman" w:cs="Times New Roman"/>
-          <w:sz w:val="20"/>
-          <w:szCs w:val="20"/>
-          <w:lang w:val="en-AU"/>
-        </w:rPr>
-        <w:t>Prof</w:t>
-      </w:r>
-      <w:r>
-        <w:rPr>
-          <w:rFonts w:ascii="Times New Roman" w:hAnsi="Times New Roman" w:cs="Times New Roman"/>
-          <w:sz w:val="20"/>
-          <w:szCs w:val="20"/>
-          <w:lang w:val="en-AU"/>
-        </w:rPr>
-        <w:t xml:space="preserve"> Chao Chen, Department of Mechanical &amp; Aerospace Engineering at Monash University (chao.chen@monash.edu); </w:t>
-      </w:r>
-    </w:p>
-    <w:p>
-      <w:pPr>
-        <w:tabs>
-          <w:tab w:val="right" w:pos="10466"/>
-        </w:tabs>
-        <w:spacing w:after="0" w:line="240" w:lineRule="auto"/>
-        <w:jc w:val="both"/>
-        <w:rPr>
-          <w:rFonts w:ascii="Times New Roman" w:hAnsi="Times New Roman" w:cs="Times New Roman"/>
-          <w:b/>
-          <w:bCs/>
-          <w:sz w:val="20"/>
-          <w:szCs w:val="20"/>
-        </w:rPr>
-      </w:pPr>
-      <w:r>
-        <w:rPr>
-          <w:rFonts w:ascii="Times New Roman" w:hAnsi="Times New Roman" w:cs="Times New Roman"/>
-          <w:sz w:val="20"/>
-          <w:szCs w:val="20"/>
-          <w:lang w:val="en-AU"/>
-        </w:rPr>
-        <w:lastRenderedPageBreak/>
-        <w:t>Dr Yunlong Tang</w:t>
-      </w:r>
-      <w:r>
-        <w:rPr>
-          <w:rFonts w:ascii="Times New Roman" w:hAnsi="Times New Roman" w:cs="Times New Roman"/>
-          <w:sz w:val="20"/>
-          <w:szCs w:val="20"/>
-          <w:lang w:val="en-AU"/>
-        </w:rPr>
-        <w:t xml:space="preserve">, Department of </w:t>
-      </w:r>
-      <w:r>
-        <w:rPr>
-          <w:rFonts w:ascii="Times New Roman" w:hAnsi="Times New Roman" w:cs="Times New Roman"/>
-          <w:sz w:val="20"/>
-          <w:szCs w:val="20"/>
-          <w:lang w:val="en-AU"/>
-        </w:rPr>
-        <w:t xml:space="preserve">Mechanical &amp; Aerospace Engineering at Monash University </w:t>
-      </w:r>
-      <w:r>
-        <w:rPr>
-          <w:rFonts w:ascii="Times New Roman" w:hAnsi="Times New Roman" w:cs="Times New Roman"/>
-          <w:sz w:val="20"/>
-          <w:szCs w:val="20"/>
-          <w:lang w:val="en-AU"/>
-        </w:rPr>
-        <w:t>(</w:t>
-      </w:r>
-      <w:r>
-        <w:rPr>
-          <w:rFonts w:ascii="Times New Roman" w:hAnsi="Times New Roman" w:cs="Times New Roman"/>
-          <w:sz w:val="20"/>
-          <w:szCs w:val="20"/>
-          <w:lang w:val="en-AU"/>
-        </w:rPr>
-        <w:t>yunlong.tang1@monash.edu</w:t>
-      </w:r>
-      <w:r>
-        <w:rPr>
-          <w:rFonts w:ascii="Times New Roman" w:hAnsi="Times New Roman" w:cs="Times New Roman"/>
-          <w:sz w:val="20"/>
-          <w:szCs w:val="20"/>
-          <w:lang w:val="en-AU"/>
-        </w:rPr>
-        <w:t>).</w:t>
       </w:r>
     </w:p>
     <w:sectPr>
@@ -6183,7 +5465,7 @@
 </file>
 
 <file path=word/endnotes.xml><?xml version="1.0" encoding="utf-8"?>
-<w:endnotes xmlns:wpc="http://schemas.microsoft.com/office/word/2010/wordprocessingCanvas" xmlns:cx="http://schemas.microsoft.com/office/drawing/2014/chartex" xmlns:cx1="http://schemas.microsoft.com/office/drawing/2015/9/8/chartex" xmlns:cx2="http://schemas.microsoft.com/office/drawing/2015/10/21/chartex" xmlns:cx3="http://schemas.microsoft.com/office/drawing/2016/5/9/chartex" xmlns:cx4="http://schemas.microsoft.com/office/drawing/2016/5/10/chartex" xmlns:cx5="http://schemas.microsoft.com/office/drawing/2016/5/11/chartex" xmlns:cx6="http://schemas.microsoft.com/office/drawing/2016/5/12/chartex" xmlns:cx7="http://schemas.microsoft.com/office/drawing/2016/5/13/chartex" xmlns:cx8="http://schemas.microsoft.com/office/drawing/2016/5/14/chartex" xmlns:mc="http://schemas.openxmlformats.org/markup-compatibility/2006" xmlns:aink="http://schemas.microsoft.com/office/drawing/2016/ink" xmlns:am3d="http://schemas.microsoft.com/office/drawing/2017/model3d" xmlns:o="urn:schemas-microsoft-com:office:office" xmlns:oel="http://schemas.microsoft.com/office/2019/extlst" xmlns:r="http://schemas.openxmlformats.org/officeDocument/2006/relationships" xmlns:m="http://schemas.openxmlformats.org/officeDocument/2006/math" xmlns:v="urn:schemas-microsoft-com:vml" xmlns:wp14="http://schemas.microsoft.com/office/word/2010/wordprocessingDrawing" xmlns:wp="http://schemas.openxmlformats.org/drawingml/2006/wordprocessingDrawing" xmlns:w10="urn:schemas-microsoft-com:office:word" xmlns:w="http://schemas.openxmlformats.org/wordprocessingml/2006/main" xmlns:w14="http://schemas.microsoft.com/office/word/2010/wordml" xmlns:w15="http://schemas.microsoft.com/office/word/2012/wordml" xmlns:w16cex="http://schemas.microsoft.com/office/word/2018/wordml/cex" xmlns:w16cid="http://schemas.microsoft.com/office/word/2016/wordml/cid" xmlns:w16="http://schemas.microsoft.com/office/word/2018/wordml" xmlns:w16du="http://schemas.microsoft.com/office/word/2023/wordml/word16du" xmlns:w16sdtdh="http://schemas.microsoft.com/office/word/2020/wordml/sdtdatahash" xmlns:w16sdtfl="http://schemas.microsoft.com/office/word/2024/wordml/sdtformatlock" xmlns:w16se="http://schemas.microsoft.com/office/word/2015/wordml/symex" xmlns:wpg="http://schemas.microsoft.com/office/word/2010/wordprocessingGroup" xmlns:wpi="http://schemas.microsoft.com/office/word/2010/wordprocessingInk" xmlns:wne="http://schemas.microsoft.com/office/word/2006/wordml" xmlns:wps="http://schemas.microsoft.com/office/word/2010/wordprocessingShape" mc:Ignorable="w14 w15 w16se w16cid w16 w16cex w16sdtdh w16sdtfl w16du wp14">
+<w:endnotes xmlns:wpc="http://schemas.microsoft.com/office/word/2010/wordprocessingCanvas" xmlns:cx="http://schemas.microsoft.com/office/drawing/2014/chartex" xmlns:cx1="http://schemas.microsoft.com/office/drawing/2015/9/8/chartex" xmlns:cx2="http://schemas.microsoft.com/office/drawing/2015/10/21/chartex" xmlns:cx3="http://schemas.microsoft.com/office/drawing/2016/5/9/chartex" xmlns:cx4="http://schemas.microsoft.com/office/drawing/2016/5/10/chartex" xmlns:cx5="http://schemas.microsoft.com/office/drawing/2016/5/11/chartex" xmlns:cx6="http://schemas.microsoft.com/office/drawing/2016/5/12/chartex" xmlns:cx7="http://schemas.microsoft.com/office/drawing/2016/5/13/chartex" xmlns:cx8="http://schemas.microsoft.com/office/drawing/2016/5/14/chartex" xmlns:mc="http://schemas.openxmlformats.org/markup-compatibility/2006" xmlns:aink="http://schemas.microsoft.com/office/drawing/2016/ink" xmlns:am3d="http://schemas.microsoft.com/office/drawing/2017/model3d" xmlns:o="urn:schemas-microsoft-com:office:office" xmlns:oel="http://schemas.microsoft.com/office/2019/extlst" xmlns:r="http://schemas.openxmlformats.org/officeDocument/2006/relationships" xmlns:m="http://schemas.openxmlformats.org/officeDocument/2006/math" xmlns:v="urn:schemas-microsoft-com:vml" xmlns:wp14="http://schemas.microsoft.com/office/word/2010/wordprocessingDrawing" xmlns:wp="http://schemas.openxmlformats.org/drawingml/2006/wordprocessingDrawing" xmlns:w10="urn:schemas-microsoft-com:office:word" xmlns:w="http://schemas.openxmlformats.org/wordprocessingml/2006/main" xmlns:w14="http://schemas.microsoft.com/office/word/2010/wordml" xmlns:w15="http://schemas.microsoft.com/office/word/2012/wordml" xmlns:w16cei="http://schemas.microsoft.com/office/word/2026/wordml/cei" xmlns:w16cex="http://schemas.microsoft.com/office/word/2018/wordml/cex" xmlns:w16cid="http://schemas.microsoft.com/office/word/2016/wordml/cid" xmlns:w16="http://schemas.microsoft.com/office/word/2018/wordml" xmlns:w16du="http://schemas.microsoft.com/office/word/2023/wordml/word16du" xmlns:w16sdtdh="http://schemas.microsoft.com/office/word/2020/wordml/sdtdatahash" xmlns:w16sdtfl="http://schemas.microsoft.com/office/word/2024/wordml/sdtformatlock" xmlns:w16se="http://schemas.microsoft.com/office/word/2015/wordml/symex" xmlns:wpg="http://schemas.microsoft.com/office/word/2010/wordprocessingGroup" xmlns:wpi="http://schemas.microsoft.com/office/word/2010/wordprocessingInk" xmlns:wne="http://schemas.microsoft.com/office/word/2006/wordml" xmlns:wps="http://schemas.microsoft.com/office/word/2010/wordprocessingShape" mc:Ignorable="w14 w15 w16se w16cid w16 w16cex w16sdtdh w16sdtfl w16du wp14">
   <w:endnote w:type="separator" w:id="-1">
     <w:p>
       <w:pPr>
@@ -6208,7 +5490,7 @@
 </file>
 
 <file path=word/footer1.xml><?xml version="1.0" encoding="utf-8"?>
-<w:ftr xmlns:wpc="http://schemas.microsoft.com/office/word/2010/wordprocessingCanvas" xmlns:cx="http://schemas.microsoft.com/office/drawing/2014/chartex" xmlns:cx1="http://schemas.microsoft.com/office/drawing/2015/9/8/chartex" xmlns:cx2="http://schemas.microsoft.com/office/drawing/2015/10/21/chartex" xmlns:cx3="http://schemas.microsoft.com/office/drawing/2016/5/9/chartex" xmlns:cx4="http://schemas.microsoft.com/office/drawing/2016/5/10/chartex" xmlns:cx5="http://schemas.microsoft.com/office/drawing/2016/5/11/chartex" xmlns:cx6="http://schemas.microsoft.com/office/drawing/2016/5/12/chartex" xmlns:cx7="http://schemas.microsoft.com/office/drawing/2016/5/13/chartex" xmlns:cx8="http://schemas.microsoft.com/office/drawing/2016/5/14/chartex" xmlns:mc="http://schemas.openxmlformats.org/markup-compatibility/2006" xmlns:aink="http://schemas.microsoft.com/office/drawing/2016/ink" xmlns:am3d="http://schemas.microsoft.com/office/drawing/2017/model3d" xmlns:o="urn:schemas-microsoft-com:office:office" xmlns:oel="http://schemas.microsoft.com/office/2019/extlst" xmlns:r="http://schemas.openxmlformats.org/officeDocument/2006/relationships" xmlns:m="http://schemas.openxmlformats.org/officeDocument/2006/math" xmlns:v="urn:schemas-microsoft-com:vml" xmlns:wp14="http://schemas.microsoft.com/office/word/2010/wordprocessingDrawing" xmlns:wp="http://schemas.openxmlformats.org/drawingml/2006/wordprocessingDrawing" xmlns:w10="urn:schemas-microsoft-com:office:word" xmlns:w="http://schemas.openxmlformats.org/wordprocessingml/2006/main" xmlns:w14="http://schemas.microsoft.com/office/word/2010/wordml" xmlns:w15="http://schemas.microsoft.com/office/word/2012/wordml" xmlns:w16cex="http://schemas.microsoft.com/office/word/2018/wordml/cex" xmlns:w16cid="http://schemas.microsoft.com/office/word/2016/wordml/cid" xmlns:w16="http://schemas.microsoft.com/office/word/2018/wordml" xmlns:w16du="http://schemas.microsoft.com/office/word/2023/wordml/word16du" xmlns:w16sdtdh="http://schemas.microsoft.com/office/word/2020/wordml/sdtdatahash" xmlns:w16sdtfl="http://schemas.microsoft.com/office/word/2024/wordml/sdtformatlock" xmlns:w16se="http://schemas.microsoft.com/office/word/2015/wordml/symex" xmlns:wpg="http://schemas.microsoft.com/office/word/2010/wordprocessingGroup" xmlns:wpi="http://schemas.microsoft.com/office/word/2010/wordprocessingInk" xmlns:wne="http://schemas.microsoft.com/office/word/2006/wordml" xmlns:wps="http://schemas.microsoft.com/office/word/2010/wordprocessingShape" mc:Ignorable="w14 w15 w16se w16cid w16 w16cex w16sdtdh w16sdtfl w16du wp14">
+<w:ftr xmlns:wpc="http://schemas.microsoft.com/office/word/2010/wordprocessingCanvas" xmlns:cx="http://schemas.microsoft.com/office/drawing/2014/chartex" xmlns:cx1="http://schemas.microsoft.com/office/drawing/2015/9/8/chartex" xmlns:cx2="http://schemas.microsoft.com/office/drawing/2015/10/21/chartex" xmlns:cx3="http://schemas.microsoft.com/office/drawing/2016/5/9/chartex" xmlns:cx4="http://schemas.microsoft.com/office/drawing/2016/5/10/chartex" xmlns:cx5="http://schemas.microsoft.com/office/drawing/2016/5/11/chartex" xmlns:cx6="http://schemas.microsoft.com/office/drawing/2016/5/12/chartex" xmlns:cx7="http://schemas.microsoft.com/office/drawing/2016/5/13/chartex" xmlns:cx8="http://schemas.microsoft.com/office/drawing/2016/5/14/chartex" xmlns:mc="http://schemas.openxmlformats.org/markup-compatibility/2006" xmlns:aink="http://schemas.microsoft.com/office/drawing/2016/ink" xmlns:am3d="http://schemas.microsoft.com/office/drawing/2017/model3d" xmlns:o="urn:schemas-microsoft-com:office:office" xmlns:oel="http://schemas.microsoft.com/office/2019/extlst" xmlns:r="http://schemas.openxmlformats.org/officeDocument/2006/relationships" xmlns:m="http://schemas.openxmlformats.org/officeDocument/2006/math" xmlns:v="urn:schemas-microsoft-com:vml" xmlns:wp14="http://schemas.microsoft.com/office/word/2010/wordprocessingDrawing" xmlns:wp="http://schemas.openxmlformats.org/drawingml/2006/wordprocessingDrawing" xmlns:w10="urn:schemas-microsoft-com:office:word" xmlns:w="http://schemas.openxmlformats.org/wordprocessingml/2006/main" xmlns:w14="http://schemas.microsoft.com/office/word/2010/wordml" xmlns:w15="http://schemas.microsoft.com/office/word/2012/wordml" xmlns:w16cei="http://schemas.microsoft.com/office/word/2026/wordml/cei" xmlns:w16cex="http://schemas.microsoft.com/office/word/2018/wordml/cex" xmlns:w16cid="http://schemas.microsoft.com/office/word/2016/wordml/cid" xmlns:w16="http://schemas.microsoft.com/office/word/2018/wordml" xmlns:w16du="http://schemas.microsoft.com/office/word/2023/wordml/word16du" xmlns:w16sdtdh="http://schemas.microsoft.com/office/word/2020/wordml/sdtdatahash" xmlns:w16sdtfl="http://schemas.microsoft.com/office/word/2024/wordml/sdtformatlock" xmlns:w16se="http://schemas.microsoft.com/office/word/2015/wordml/symex" xmlns:wpg="http://schemas.microsoft.com/office/word/2010/wordprocessingGroup" xmlns:wpi="http://schemas.microsoft.com/office/word/2010/wordprocessingInk" xmlns:wne="http://schemas.microsoft.com/office/word/2006/wordml" xmlns:wps="http://schemas.microsoft.com/office/word/2010/wordprocessingShape" mc:Ignorable="w14 w15 w16se w16cid w16 w16cex w16sdtdh w16sdtfl w16du wp14">
   <w:p>
     <w:pPr>
       <w:pStyle w:val="Footer"/>
@@ -6338,7 +5620,7 @@
 </file>
 
 <file path=word/footer2.xml><?xml version="1.0" encoding="utf-8"?>
-<w:ftr xmlns:wpc="http://schemas.microsoft.com/office/word/2010/wordprocessingCanvas" xmlns:cx="http://schemas.microsoft.com/office/drawing/2014/chartex" xmlns:cx1="http://schemas.microsoft.com/office/drawing/2015/9/8/chartex" xmlns:cx2="http://schemas.microsoft.com/office/drawing/2015/10/21/chartex" xmlns:cx3="http://schemas.microsoft.com/office/drawing/2016/5/9/chartex" xmlns:cx4="http://schemas.microsoft.com/office/drawing/2016/5/10/chartex" xmlns:cx5="http://schemas.microsoft.com/office/drawing/2016/5/11/chartex" xmlns:cx6="http://schemas.microsoft.com/office/drawing/2016/5/12/chartex" xmlns:cx7="http://schemas.microsoft.com/office/drawing/2016/5/13/chartex" xmlns:cx8="http://schemas.microsoft.com/office/drawing/2016/5/14/chartex" xmlns:mc="http://schemas.openxmlformats.org/markup-compatibility/2006" xmlns:aink="http://schemas.microsoft.com/office/drawing/2016/ink" xmlns:am3d="http://schemas.microsoft.com/office/drawing/2017/model3d" xmlns:o="urn:schemas-microsoft-com:office:office" xmlns:oel="http://schemas.microsoft.com/office/2019/extlst" xmlns:r="http://schemas.openxmlformats.org/officeDocument/2006/relationships" xmlns:m="http://schemas.openxmlformats.org/officeDocument/2006/math" xmlns:v="urn:schemas-microsoft-com:vml" xmlns:wp14="http://schemas.microsoft.com/office/word/2010/wordprocessingDrawing" xmlns:wp="http://schemas.openxmlformats.org/drawingml/2006/wordprocessingDrawing" xmlns:w10="urn:schemas-microsoft-com:office:word" xmlns:w="http://schemas.openxmlformats.org/wordprocessingml/2006/main" xmlns:w14="http://schemas.microsoft.com/office/word/2010/wordml" xmlns:w15="http://schemas.microsoft.com/office/word/2012/wordml" xmlns:w16cex="http://schemas.microsoft.com/office/word/2018/wordml/cex" xmlns:w16cid="http://schemas.microsoft.com/office/word/2016/wordml/cid" xmlns:w16="http://schemas.microsoft.com/office/word/2018/wordml" xmlns:w16du="http://schemas.microsoft.com/office/word/2023/wordml/word16du" xmlns:w16sdtdh="http://schemas.microsoft.com/office/word/2020/wordml/sdtdatahash" xmlns:w16sdtfl="http://schemas.microsoft.com/office/word/2024/wordml/sdtformatlock" xmlns:w16se="http://schemas.microsoft.com/office/word/2015/wordml/symex" xmlns:wpg="http://schemas.microsoft.com/office/word/2010/wordprocessingGroup" xmlns:wpi="http://schemas.microsoft.com/office/word/2010/wordprocessingInk" xmlns:wne="http://schemas.microsoft.com/office/word/2006/wordml" xmlns:wps="http://schemas.microsoft.com/office/word/2010/wordprocessingShape" mc:Ignorable="w14 w15 w16se w16cid w16 w16cex w16sdtdh w16sdtfl w16du wp14">
+<w:ftr xmlns:wpc="http://schemas.microsoft.com/office/word/2010/wordprocessingCanvas" xmlns:cx="http://schemas.microsoft.com/office/drawing/2014/chartex" xmlns:cx1="http://schemas.microsoft.com/office/drawing/2015/9/8/chartex" xmlns:cx2="http://schemas.microsoft.com/office/drawing/2015/10/21/chartex" xmlns:cx3="http://schemas.microsoft.com/office/drawing/2016/5/9/chartex" xmlns:cx4="http://schemas.microsoft.com/office/drawing/2016/5/10/chartex" xmlns:cx5="http://schemas.microsoft.com/office/drawing/2016/5/11/chartex" xmlns:cx6="http://schemas.microsoft.com/office/drawing/2016/5/12/chartex" xmlns:cx7="http://schemas.microsoft.com/office/drawing/2016/5/13/chartex" xmlns:cx8="http://schemas.microsoft.com/office/drawing/2016/5/14/chartex" xmlns:mc="http://schemas.openxmlformats.org/markup-compatibility/2006" xmlns:aink="http://schemas.microsoft.com/office/drawing/2016/ink" xmlns:am3d="http://schemas.microsoft.com/office/drawing/2017/model3d" xmlns:o="urn:schemas-microsoft-com:office:office" xmlns:oel="http://schemas.microsoft.com/office/2019/extlst" xmlns:r="http://schemas.openxmlformats.org/officeDocument/2006/relationships" xmlns:m="http://schemas.openxmlformats.org/officeDocument/2006/math" xmlns:v="urn:schemas-microsoft-com:vml" xmlns:wp14="http://schemas.microsoft.com/office/word/2010/wordprocessingDrawing" xmlns:wp="http://schemas.openxmlformats.org/drawingml/2006/wordprocessingDrawing" xmlns:w10="urn:schemas-microsoft-com:office:word" xmlns:w="http://schemas.openxmlformats.org/wordprocessingml/2006/main" xmlns:w14="http://schemas.microsoft.com/office/word/2010/wordml" xmlns:w15="http://schemas.microsoft.com/office/word/2012/wordml" xmlns:w16cei="http://schemas.microsoft.com/office/word/2026/wordml/cei" xmlns:w16cex="http://schemas.microsoft.com/office/word/2018/wordml/cex" xmlns:w16cid="http://schemas.microsoft.com/office/word/2016/wordml/cid" xmlns:w16="http://schemas.microsoft.com/office/word/2018/wordml" xmlns:w16du="http://schemas.microsoft.com/office/word/2023/wordml/word16du" xmlns:w16sdtdh="http://schemas.microsoft.com/office/word/2020/wordml/sdtdatahash" xmlns:w16sdtfl="http://schemas.microsoft.com/office/word/2024/wordml/sdtformatlock" xmlns:w16se="http://schemas.microsoft.com/office/word/2015/wordml/symex" xmlns:wpg="http://schemas.microsoft.com/office/word/2010/wordprocessingGroup" xmlns:wpi="http://schemas.microsoft.com/office/word/2010/wordprocessingInk" xmlns:wne="http://schemas.microsoft.com/office/word/2006/wordml" xmlns:wps="http://schemas.microsoft.com/office/word/2010/wordprocessingShape" mc:Ignorable="w14 w15 w16se w16cid w16 w16cex w16sdtdh w16sdtfl w16du wp14">
   <w:p>
     <w:pPr>
       <w:pStyle w:val="Footer"/>
@@ -6468,7 +5750,7 @@
 </file>
 
 <file path=word/footer3.xml><?xml version="1.0" encoding="utf-8"?>
-<w:ftr xmlns:wpc="http://schemas.microsoft.com/office/word/2010/wordprocessingCanvas" xmlns:cx="http://schemas.microsoft.com/office/drawing/2014/chartex" xmlns:cx1="http://schemas.microsoft.com/office/drawing/2015/9/8/chartex" xmlns:cx2="http://schemas.microsoft.com/office/drawing/2015/10/21/chartex" xmlns:cx3="http://schemas.microsoft.com/office/drawing/2016/5/9/chartex" xmlns:cx4="http://schemas.microsoft.com/office/drawing/2016/5/10/chartex" xmlns:cx5="http://schemas.microsoft.com/office/drawing/2016/5/11/chartex" xmlns:cx6="http://schemas.microsoft.com/office/drawing/2016/5/12/chartex" xmlns:cx7="http://schemas.microsoft.com/office/drawing/2016/5/13/chartex" xmlns:cx8="http://schemas.microsoft.com/office/drawing/2016/5/14/chartex" xmlns:mc="http://schemas.openxmlformats.org/markup-compatibility/2006" xmlns:aink="http://schemas.microsoft.com/office/drawing/2016/ink" xmlns:am3d="http://schemas.microsoft.com/office/drawing/2017/model3d" xmlns:o="urn:schemas-microsoft-com:office:office" xmlns:oel="http://schemas.microsoft.com/office/2019/extlst" xmlns:r="http://schemas.openxmlformats.org/officeDocument/2006/relationships" xmlns:m="http://schemas.openxmlformats.org/officeDocument/2006/math" xmlns:v="urn:schemas-microsoft-com:vml" xmlns:wp14="http://schemas.microsoft.com/office/word/2010/wordprocessingDrawing" xmlns:wp="http://schemas.openxmlformats.org/drawingml/2006/wordprocessingDrawing" xmlns:w10="urn:schemas-microsoft-com:office:word" xmlns:w="http://schemas.openxmlformats.org/wordprocessingml/2006/main" xmlns:w14="http://schemas.microsoft.com/office/word/2010/wordml" xmlns:w15="http://schemas.microsoft.com/office/word/2012/wordml" xmlns:w16cex="http://schemas.microsoft.com/office/word/2018/wordml/cex" xmlns:w16cid="http://schemas.microsoft.com/office/word/2016/wordml/cid" xmlns:w16="http://schemas.microsoft.com/office/word/2018/wordml" xmlns:w16du="http://schemas.microsoft.com/office/word/2023/wordml/word16du" xmlns:w16sdtdh="http://schemas.microsoft.com/office/word/2020/wordml/sdtdatahash" xmlns:w16sdtfl="http://schemas.microsoft.com/office/word/2024/wordml/sdtformatlock" xmlns:w16se="http://schemas.microsoft.com/office/word/2015/wordml/symex" xmlns:wpg="http://schemas.microsoft.com/office/word/2010/wordprocessingGroup" xmlns:wpi="http://schemas.microsoft.com/office/word/2010/wordprocessingInk" xmlns:wne="http://schemas.microsoft.com/office/word/2006/wordml" xmlns:wps="http://schemas.microsoft.com/office/word/2010/wordprocessingShape" mc:Ignorable="w14 w15 w16se w16cid w16 w16cex w16sdtdh w16sdtfl w16du wp14">
+<w:ftr xmlns:wpc="http://schemas.microsoft.com/office/word/2010/wordprocessingCanvas" xmlns:cx="http://schemas.microsoft.com/office/drawing/2014/chartex" xmlns:cx1="http://schemas.microsoft.com/office/drawing/2015/9/8/chartex" xmlns:cx2="http://schemas.microsoft.com/office/drawing/2015/10/21/chartex" xmlns:cx3="http://schemas.microsoft.com/office/drawing/2016/5/9/chartex" xmlns:cx4="http://schemas.microsoft.com/office/drawing/2016/5/10/chartex" xmlns:cx5="http://schemas.microsoft.com/office/drawing/2016/5/11/chartex" xmlns:cx6="http://schemas.microsoft.com/office/drawing/2016/5/12/chartex" xmlns:cx7="http://schemas.microsoft.com/office/drawing/2016/5/13/chartex" xmlns:cx8="http://schemas.microsoft.com/office/drawing/2016/5/14/chartex" xmlns:mc="http://schemas.openxmlformats.org/markup-compatibility/2006" xmlns:aink="http://schemas.microsoft.com/office/drawing/2016/ink" xmlns:am3d="http://schemas.microsoft.com/office/drawing/2017/model3d" xmlns:o="urn:schemas-microsoft-com:office:office" xmlns:oel="http://schemas.microsoft.com/office/2019/extlst" xmlns:r="http://schemas.openxmlformats.org/officeDocument/2006/relationships" xmlns:m="http://schemas.openxmlformats.org/officeDocument/2006/math" xmlns:v="urn:schemas-microsoft-com:vml" xmlns:wp14="http://schemas.microsoft.com/office/word/2010/wordprocessingDrawing" xmlns:wp="http://schemas.openxmlformats.org/drawingml/2006/wordprocessingDrawing" xmlns:w10="urn:schemas-microsoft-com:office:word" xmlns:w="http://schemas.openxmlformats.org/wordprocessingml/2006/main" xmlns:w14="http://schemas.microsoft.com/office/word/2010/wordml" xmlns:w15="http://schemas.microsoft.com/office/word/2012/wordml" xmlns:w16cei="http://schemas.microsoft.com/office/word/2026/wordml/cei" xmlns:w16cex="http://schemas.microsoft.com/office/word/2018/wordml/cex" xmlns:w16cid="http://schemas.microsoft.com/office/word/2016/wordml/cid" xmlns:w16="http://schemas.microsoft.com/office/word/2018/wordml" xmlns:w16du="http://schemas.microsoft.com/office/word/2023/wordml/word16du" xmlns:w16sdtdh="http://schemas.microsoft.com/office/word/2020/wordml/sdtdatahash" xmlns:w16sdtfl="http://schemas.microsoft.com/office/word/2024/wordml/sdtformatlock" xmlns:w16se="http://schemas.microsoft.com/office/word/2015/wordml/symex" xmlns:wpg="http://schemas.microsoft.com/office/word/2010/wordprocessingGroup" xmlns:wpi="http://schemas.microsoft.com/office/word/2010/wordprocessingInk" xmlns:wne="http://schemas.microsoft.com/office/word/2006/wordml" xmlns:wps="http://schemas.microsoft.com/office/word/2010/wordprocessingShape" mc:Ignorable="w14 w15 w16se w16cid w16 w16cex w16sdtdh w16sdtfl w16du wp14">
   <w:p>
     <w:pPr>
       <w:pStyle w:val="Footer"/>
@@ -6598,7 +5880,7 @@
 </file>
 
 <file path=word/footnotes.xml><?xml version="1.0" encoding="utf-8"?>
-<w:footnotes xmlns:wpc="http://schemas.microsoft.com/office/word/2010/wordprocessingCanvas" xmlns:cx="http://schemas.microsoft.com/office/drawing/2014/chartex" xmlns:cx1="http://schemas.microsoft.com/office/drawing/2015/9/8/chartex" xmlns:cx2="http://schemas.microsoft.com/office/drawing/2015/10/21/chartex" xmlns:cx3="http://schemas.microsoft.com/office/drawing/2016/5/9/chartex" xmlns:cx4="http://schemas.microsoft.com/office/drawing/2016/5/10/chartex" xmlns:cx5="http://schemas.microsoft.com/office/drawing/2016/5/11/chartex" xmlns:cx6="http://schemas.microsoft.com/office/drawing/2016/5/12/chartex" xmlns:cx7="http://schemas.microsoft.com/office/drawing/2016/5/13/chartex" xmlns:cx8="http://schemas.microsoft.com/office/drawing/2016/5/14/chartex" xmlns:mc="http://schemas.openxmlformats.org/markup-compatibility/2006" xmlns:aink="http://schemas.microsoft.com/office/drawing/2016/ink" xmlns:am3d="http://schemas.microsoft.com/office/drawing/2017/model3d" xmlns:o="urn:schemas-microsoft-com:office:office" xmlns:oel="http://schemas.microsoft.com/office/2019/extlst" xmlns:r="http://schemas.openxmlformats.org/officeDocument/2006/relationships" xmlns:m="http://schemas.openxmlformats.org/officeDocument/2006/math" xmlns:v="urn:schemas-microsoft-com:vml" xmlns:wp14="http://schemas.microsoft.com/office/word/2010/wordprocessingDrawing" xmlns:wp="http://schemas.openxmlformats.org/drawingml/2006/wordprocessingDrawing" xmlns:w10="urn:schemas-microsoft-com:office:word" xmlns:w="http://schemas.openxmlformats.org/wordprocessingml/2006/main" xmlns:w14="http://schemas.microsoft.com/office/word/2010/wordml" xmlns:w15="http://schemas.microsoft.com/office/word/2012/wordml" xmlns:w16cex="http://schemas.microsoft.com/office/word/2018/wordml/cex" xmlns:w16cid="http://schemas.microsoft.com/office/word/2016/wordml/cid" xmlns:w16="http://schemas.microsoft.com/office/word/2018/wordml" xmlns:w16du="http://schemas.microsoft.com/office/word/2023/wordml/word16du" xmlns:w16sdtdh="http://schemas.microsoft.com/office/word/2020/wordml/sdtdatahash" xmlns:w16sdtfl="http://schemas.microsoft.com/office/word/2024/wordml/sdtformatlock" xmlns:w16se="http://schemas.microsoft.com/office/word/2015/wordml/symex" xmlns:wpg="http://schemas.microsoft.com/office/word/2010/wordprocessingGroup" xmlns:wpi="http://schemas.microsoft.com/office/word/2010/wordprocessingInk" xmlns:wne="http://schemas.microsoft.com/office/word/2006/wordml" xmlns:wps="http://schemas.microsoft.com/office/word/2010/wordprocessingShape" mc:Ignorable="w14 w15 w16se w16cid w16 w16cex w16sdtdh w16sdtfl w16du wp14">
+<w:footnotes xmlns:wpc="http://schemas.microsoft.com/office/word/2010/wordprocessingCanvas" xmlns:cx="http://schemas.microsoft.com/office/drawing/2014/chartex" xmlns:cx1="http://schemas.microsoft.com/office/drawing/2015/9/8/chartex" xmlns:cx2="http://schemas.microsoft.com/office/drawing/2015/10/21/chartex" xmlns:cx3="http://schemas.microsoft.com/office/drawing/2016/5/9/chartex" xmlns:cx4="http://schemas.microsoft.com/office/drawing/2016/5/10/chartex" xmlns:cx5="http://schemas.microsoft.com/office/drawing/2016/5/11/chartex" xmlns:cx6="http://schemas.microsoft.com/office/drawing/2016/5/12/chartex" xmlns:cx7="http://schemas.microsoft.com/office/drawing/2016/5/13/chartex" xmlns:cx8="http://schemas.microsoft.com/office/drawing/2016/5/14/chartex" xmlns:mc="http://schemas.openxmlformats.org/markup-compatibility/2006" xmlns:aink="http://schemas.microsoft.com/office/drawing/2016/ink" xmlns:am3d="http://schemas.microsoft.com/office/drawing/2017/model3d" xmlns:o="urn:schemas-microsoft-com:office:office" xmlns:oel="http://schemas.microsoft.com/office/2019/extlst" xmlns:r="http://schemas.openxmlformats.org/officeDocument/2006/relationships" xmlns:m="http://schemas.openxmlformats.org/officeDocument/2006/math" xmlns:v="urn:schemas-microsoft-com:vml" xmlns:wp14="http://schemas.microsoft.com/office/word/2010/wordprocessingDrawing" xmlns:wp="http://schemas.openxmlformats.org/drawingml/2006/wordprocessingDrawing" xmlns:w10="urn:schemas-microsoft-com:office:word" xmlns:w="http://schemas.openxmlformats.org/wordprocessingml/2006/main" xmlns:w14="http://schemas.microsoft.com/office/word/2010/wordml" xmlns:w15="http://schemas.microsoft.com/office/word/2012/wordml" xmlns:w16cei="http://schemas.microsoft.com/office/word/2026/wordml/cei" xmlns:w16cex="http://schemas.microsoft.com/office/word/2018/wordml/cex" xmlns:w16cid="http://schemas.microsoft.com/office/word/2016/wordml/cid" xmlns:w16="http://schemas.microsoft.com/office/word/2018/wordml" xmlns:w16du="http://schemas.microsoft.com/office/word/2023/wordml/word16du" xmlns:w16sdtdh="http://schemas.microsoft.com/office/word/2020/wordml/sdtdatahash" xmlns:w16sdtfl="http://schemas.microsoft.com/office/word/2024/wordml/sdtformatlock" xmlns:w16se="http://schemas.microsoft.com/office/word/2015/wordml/symex" xmlns:wpg="http://schemas.microsoft.com/office/word/2010/wordprocessingGroup" xmlns:wpi="http://schemas.microsoft.com/office/word/2010/wordprocessingInk" xmlns:wne="http://schemas.microsoft.com/office/word/2006/wordml" xmlns:wps="http://schemas.microsoft.com/office/word/2010/wordprocessingShape" mc:Ignorable="w14 w15 w16se w16cid w16 w16cex w16sdtdh w16sdtfl w16du wp14">
   <w:footnote w:type="separator" w:id="-1">
     <w:p>
       <w:pPr>
@@ -6623,7 +5905,7 @@
 </file>
 
 <file path=word/header1.xml><?xml version="1.0" encoding="utf-8"?>
-<w:hdr xmlns:wpc="http://schemas.microsoft.com/office/word/2010/wordprocessingCanvas" xmlns:cx="http://schemas.microsoft.com/office/drawing/2014/chartex" xmlns:cx1="http://schemas.microsoft.com/office/drawing/2015/9/8/chartex" xmlns:cx2="http://schemas.microsoft.com/office/drawing/2015/10/21/chartex" xmlns:cx3="http://schemas.microsoft.com/office/drawing/2016/5/9/chartex" xmlns:cx4="http://schemas.microsoft.com/office/drawing/2016/5/10/chartex" xmlns:cx5="http://schemas.microsoft.com/office/drawing/2016/5/11/chartex" xmlns:cx6="http://schemas.microsoft.com/office/drawing/2016/5/12/chartex" xmlns:cx7="http://schemas.microsoft.com/office/drawing/2016/5/13/chartex" xmlns:cx8="http://schemas.microsoft.com/office/drawing/2016/5/14/chartex" xmlns:mc="http://schemas.openxmlformats.org/markup-compatibility/2006" xmlns:aink="http://schemas.microsoft.com/office/drawing/2016/ink" xmlns:am3d="http://schemas.microsoft.com/office/drawing/2017/model3d" xmlns:o="urn:schemas-microsoft-com:office:office" xmlns:oel="http://schemas.microsoft.com/office/2019/extlst" xmlns:r="http://schemas.openxmlformats.org/officeDocument/2006/relationships" xmlns:m="http://schemas.openxmlformats.org/officeDocument/2006/math" xmlns:v="urn:schemas-microsoft-com:vml" xmlns:wp14="http://schemas.microsoft.com/office/word/2010/wordprocessingDrawing" xmlns:wp="http://schemas.openxmlformats.org/drawingml/2006/wordprocessingDrawing" xmlns:w10="urn:schemas-microsoft-com:office:word" xmlns:w="http://schemas.openxmlformats.org/wordprocessingml/2006/main" xmlns:w14="http://schemas.microsoft.com/office/word/2010/wordml" xmlns:w15="http://schemas.microsoft.com/office/word/2012/wordml" xmlns:w16cex="http://schemas.microsoft.com/office/word/2018/wordml/cex" xmlns:w16cid="http://schemas.microsoft.com/office/word/2016/wordml/cid" xmlns:w16="http://schemas.microsoft.com/office/word/2018/wordml" xmlns:w16du="http://schemas.microsoft.com/office/word/2023/wordml/word16du" xmlns:w16sdtdh="http://schemas.microsoft.com/office/word/2020/wordml/sdtdatahash" xmlns:w16sdtfl="http://schemas.microsoft.com/office/word/2024/wordml/sdtformatlock" xmlns:w16se="http://schemas.microsoft.com/office/word/2015/wordml/symex" xmlns:wpg="http://schemas.microsoft.com/office/word/2010/wordprocessingGroup" xmlns:wpi="http://schemas.microsoft.com/office/word/2010/wordprocessingInk" xmlns:wne="http://schemas.microsoft.com/office/word/2006/wordml" xmlns:wps="http://schemas.microsoft.com/office/word/2010/wordprocessingShape" mc:Ignorable="w14 w15 w16se w16cid w16 w16cex w16sdtdh w16sdtfl w16du wp14">
+<w:hdr xmlns:wpc="http://schemas.microsoft.com/office/word/2010/wordprocessingCanvas" xmlns:cx="http://schemas.microsoft.com/office/drawing/2014/chartex" xmlns:cx1="http://schemas.microsoft.com/office/drawing/2015/9/8/chartex" xmlns:cx2="http://schemas.microsoft.com/office/drawing/2015/10/21/chartex" xmlns:cx3="http://schemas.microsoft.com/office/drawing/2016/5/9/chartex" xmlns:cx4="http://schemas.microsoft.com/office/drawing/2016/5/10/chartex" xmlns:cx5="http://schemas.microsoft.com/office/drawing/2016/5/11/chartex" xmlns:cx6="http://schemas.microsoft.com/office/drawing/2016/5/12/chartex" xmlns:cx7="http://schemas.microsoft.com/office/drawing/2016/5/13/chartex" xmlns:cx8="http://schemas.microsoft.com/office/drawing/2016/5/14/chartex" xmlns:mc="http://schemas.openxmlformats.org/markup-compatibility/2006" xmlns:aink="http://schemas.microsoft.com/office/drawing/2016/ink" xmlns:am3d="http://schemas.microsoft.com/office/drawing/2017/model3d" xmlns:o="urn:schemas-microsoft-com:office:office" xmlns:oel="http://schemas.microsoft.com/office/2019/extlst" xmlns:r="http://schemas.openxmlformats.org/officeDocument/2006/relationships" xmlns:m="http://schemas.openxmlformats.org/officeDocument/2006/math" xmlns:v="urn:schemas-microsoft-com:vml" xmlns:wp14="http://schemas.microsoft.com/office/word/2010/wordprocessingDrawing" xmlns:wp="http://schemas.openxmlformats.org/drawingml/2006/wordprocessingDrawing" xmlns:w10="urn:schemas-microsoft-com:office:word" xmlns:w="http://schemas.openxmlformats.org/wordprocessingml/2006/main" xmlns:w14="http://schemas.microsoft.com/office/word/2010/wordml" xmlns:w15="http://schemas.microsoft.com/office/word/2012/wordml" xmlns:w16cei="http://schemas.microsoft.com/office/word/2026/wordml/cei" xmlns:w16cex="http://schemas.microsoft.com/office/word/2018/wordml/cex" xmlns:w16cid="http://schemas.microsoft.com/office/word/2016/wordml/cid" xmlns:w16="http://schemas.microsoft.com/office/word/2018/wordml" xmlns:w16du="http://schemas.microsoft.com/office/word/2023/wordml/word16du" xmlns:w16sdtdh="http://schemas.microsoft.com/office/word/2020/wordml/sdtdatahash" xmlns:w16sdtfl="http://schemas.microsoft.com/office/word/2024/wordml/sdtformatlock" xmlns:w16se="http://schemas.microsoft.com/office/word/2015/wordml/symex" xmlns:wpg="http://schemas.microsoft.com/office/word/2010/wordprocessingGroup" xmlns:wpi="http://schemas.microsoft.com/office/word/2010/wordprocessingInk" xmlns:wne="http://schemas.microsoft.com/office/word/2006/wordml" xmlns:wps="http://schemas.microsoft.com/office/word/2010/wordprocessingShape" mc:Ignorable="w14 w15 w16se w16cid w16 w16cex w16sdtdh w16sdtfl w16du wp14">
   <w:p>
     <w:pPr>
       <w:pStyle w:val="Header"/>
@@ -6753,7 +6035,7 @@
 </file>
 
 <file path=word/header2.xml><?xml version="1.0" encoding="utf-8"?>
-<w:hdr xmlns:wpc="http://schemas.microsoft.com/office/word/2010/wordprocessingCanvas" xmlns:cx="http://schemas.microsoft.com/office/drawing/2014/chartex" xmlns:cx1="http://schemas.microsoft.com/office/drawing/2015/9/8/chartex" xmlns:cx2="http://schemas.microsoft.com/office/drawing/2015/10/21/chartex" xmlns:cx3="http://schemas.microsoft.com/office/drawing/2016/5/9/chartex" xmlns:cx4="http://schemas.microsoft.com/office/drawing/2016/5/10/chartex" xmlns:cx5="http://schemas.microsoft.com/office/drawing/2016/5/11/chartex" xmlns:cx6="http://schemas.microsoft.com/office/drawing/2016/5/12/chartex" xmlns:cx7="http://schemas.microsoft.com/office/drawing/2016/5/13/chartex" xmlns:cx8="http://schemas.microsoft.com/office/drawing/2016/5/14/chartex" xmlns:mc="http://schemas.openxmlformats.org/markup-compatibility/2006" xmlns:aink="http://schemas.microsoft.com/office/drawing/2016/ink" xmlns:am3d="http://schemas.microsoft.com/office/drawing/2017/model3d" xmlns:o="urn:schemas-microsoft-com:office:office" xmlns:oel="http://schemas.microsoft.com/office/2019/extlst" xmlns:r="http://schemas.openxmlformats.org/officeDocument/2006/relationships" xmlns:m="http://schemas.openxmlformats.org/officeDocument/2006/math" xmlns:v="urn:schemas-microsoft-com:vml" xmlns:wp14="http://schemas.microsoft.com/office/word/2010/wordprocessingDrawing" xmlns:wp="http://schemas.openxmlformats.org/drawingml/2006/wordprocessingDrawing" xmlns:w10="urn:schemas-microsoft-com:office:word" xmlns:w="http://schemas.openxmlformats.org/wordprocessingml/2006/main" xmlns:w14="http://schemas.microsoft.com/office/word/2010/wordml" xmlns:w15="http://schemas.microsoft.com/office/word/2012/wordml" xmlns:w16cex="http://schemas.microsoft.com/office/word/2018/wordml/cex" xmlns:w16cid="http://schemas.microsoft.com/office/word/2016/wordml/cid" xmlns:w16="http://schemas.microsoft.com/office/word/2018/wordml" xmlns:w16du="http://schemas.microsoft.com/office/word/2023/wordml/word16du" xmlns:w16sdtdh="http://schemas.microsoft.com/office/word/2020/wordml/sdtdatahash" xmlns:w16sdtfl="http://schemas.microsoft.com/office/word/2024/wordml/sdtformatlock" xmlns:w16se="http://schemas.microsoft.com/office/word/2015/wordml/symex" xmlns:wpg="http://schemas.microsoft.com/office/word/2010/wordprocessingGroup" xmlns:wpi="http://schemas.microsoft.com/office/word/2010/wordprocessingInk" xmlns:wne="http://schemas.microsoft.com/office/word/2006/wordml" xmlns:wps="http://schemas.microsoft.com/office/word/2010/wordprocessingShape" mc:Ignorable="w14 w15 w16se w16cid w16 w16cex w16sdtdh w16sdtfl w16du wp14">
+<w:hdr xmlns:wpc="http://schemas.microsoft.com/office/word/2010/wordprocessingCanvas" xmlns:cx="http://schemas.microsoft.com/office/drawing/2014/chartex" xmlns:cx1="http://schemas.microsoft.com/office/drawing/2015/9/8/chartex" xmlns:cx2="http://schemas.microsoft.com/office/drawing/2015/10/21/chartex" xmlns:cx3="http://schemas.microsoft.com/office/drawing/2016/5/9/chartex" xmlns:cx4="http://schemas.microsoft.com/office/drawing/2016/5/10/chartex" xmlns:cx5="http://schemas.microsoft.com/office/drawing/2016/5/11/chartex" xmlns:cx6="http://schemas.microsoft.com/office/drawing/2016/5/12/chartex" xmlns:cx7="http://schemas.microsoft.com/office/drawing/2016/5/13/chartex" xmlns:cx8="http://schemas.microsoft.com/office/drawing/2016/5/14/chartex" xmlns:mc="http://schemas.openxmlformats.org/markup-compatibility/2006" xmlns:aink="http://schemas.microsoft.com/office/drawing/2016/ink" xmlns:am3d="http://schemas.microsoft.com/office/drawing/2017/model3d" xmlns:o="urn:schemas-microsoft-com:office:office" xmlns:oel="http://schemas.microsoft.com/office/2019/extlst" xmlns:r="http://schemas.openxmlformats.org/officeDocument/2006/relationships" xmlns:m="http://schemas.openxmlformats.org/officeDocument/2006/math" xmlns:v="urn:schemas-microsoft-com:vml" xmlns:wp14="http://schemas.microsoft.com/office/word/2010/wordprocessingDrawing" xmlns:wp="http://schemas.openxmlformats.org/drawingml/2006/wordprocessingDrawing" xmlns:w10="urn:schemas-microsoft-com:office:word" xmlns:w="http://schemas.openxmlformats.org/wordprocessingml/2006/main" xmlns:w14="http://schemas.microsoft.com/office/word/2010/wordml" xmlns:w15="http://schemas.microsoft.com/office/word/2012/wordml" xmlns:w16cei="http://schemas.microsoft.com/office/word/2026/wordml/cei" xmlns:w16cex="http://schemas.microsoft.com/office/word/2018/wordml/cex" xmlns:w16cid="http://schemas.microsoft.com/office/word/2016/wordml/cid" xmlns:w16="http://schemas.microsoft.com/office/word/2018/wordml" xmlns:w16du="http://schemas.microsoft.com/office/word/2023/wordml/word16du" xmlns:w16sdtdh="http://schemas.microsoft.com/office/word/2020/wordml/sdtdatahash" xmlns:w16sdtfl="http://schemas.microsoft.com/office/word/2024/wordml/sdtformatlock" xmlns:w16se="http://schemas.microsoft.com/office/word/2015/wordml/symex" xmlns:wpg="http://schemas.microsoft.com/office/word/2010/wordprocessingGroup" xmlns:wpi="http://schemas.microsoft.com/office/word/2010/wordprocessingInk" xmlns:wne="http://schemas.microsoft.com/office/word/2006/wordml" xmlns:wps="http://schemas.microsoft.com/office/word/2010/wordprocessingShape" mc:Ignorable="w14 w15 w16se w16cid w16 w16cex w16sdtdh w16sdtfl w16du wp14">
   <w:p>
     <w:pPr>
       <w:pStyle w:val="Header"/>
@@ -6883,7 +6165,7 @@
 </file>
 
 <file path=word/header3.xml><?xml version="1.0" encoding="utf-8"?>
-<w:hdr xmlns:wpc="http://schemas.microsoft.com/office/word/2010/wordprocessingCanvas" xmlns:cx="http://schemas.microsoft.com/office/drawing/2014/chartex" xmlns:cx1="http://schemas.microsoft.com/office/drawing/2015/9/8/chartex" xmlns:cx2="http://schemas.microsoft.com/office/drawing/2015/10/21/chartex" xmlns:cx3="http://schemas.microsoft.com/office/drawing/2016/5/9/chartex" xmlns:cx4="http://schemas.microsoft.com/office/drawing/2016/5/10/chartex" xmlns:cx5="http://schemas.microsoft.com/office/drawing/2016/5/11/chartex" xmlns:cx6="http://schemas.microsoft.com/office/drawing/2016/5/12/chartex" xmlns:cx7="http://schemas.microsoft.com/office/drawing/2016/5/13/chartex" xmlns:cx8="http://schemas.microsoft.com/office/drawing/2016/5/14/chartex" xmlns:mc="http://schemas.openxmlformats.org/markup-compatibility/2006" xmlns:aink="http://schemas.microsoft.com/office/drawing/2016/ink" xmlns:am3d="http://schemas.microsoft.com/office/drawing/2017/model3d" xmlns:o="urn:schemas-microsoft-com:office:office" xmlns:oel="http://schemas.microsoft.com/office/2019/extlst" xmlns:r="http://schemas.openxmlformats.org/officeDocument/2006/relationships" xmlns:m="http://schemas.openxmlformats.org/officeDocument/2006/math" xmlns:v="urn:schemas-microsoft-com:vml" xmlns:wp14="http://schemas.microsoft.com/office/word/2010/wordprocessingDrawing" xmlns:wp="http://schemas.openxmlformats.org/drawingml/2006/wordprocessingDrawing" xmlns:w10="urn:schemas-microsoft-com:office:word" xmlns:w="http://schemas.openxmlformats.org/wordprocessingml/2006/main" xmlns:w14="http://schemas.microsoft.com/office/word/2010/wordml" xmlns:w15="http://schemas.microsoft.com/office/word/2012/wordml" xmlns:w16cex="http://schemas.microsoft.com/office/word/2018/wordml/cex" xmlns:w16cid="http://schemas.microsoft.com/office/word/2016/wordml/cid" xmlns:w16="http://schemas.microsoft.com/office/word/2018/wordml" xmlns:w16du="http://schemas.microsoft.com/office/word/2023/wordml/word16du" xmlns:w16sdtdh="http://schemas.microsoft.com/office/word/2020/wordml/sdtdatahash" xmlns:w16sdtfl="http://schemas.microsoft.com/office/word/2024/wordml/sdtformatlock" xmlns:w16se="http://schemas.microsoft.com/office/word/2015/wordml/symex" xmlns:wpg="http://schemas.microsoft.com/office/word/2010/wordprocessingGroup" xmlns:wpi="http://schemas.microsoft.com/office/word/2010/wordprocessingInk" xmlns:wne="http://schemas.microsoft.com/office/word/2006/wordml" xmlns:wps="http://schemas.microsoft.com/office/word/2010/wordprocessingShape" mc:Ignorable="w14 w15 w16se w16cid w16 w16cex w16sdtdh w16sdtfl w16du wp14">
+<w:hdr xmlns:wpc="http://schemas.microsoft.com/office/word/2010/wordprocessingCanvas" xmlns:cx="http://schemas.microsoft.com/office/drawing/2014/chartex" xmlns:cx1="http://schemas.microsoft.com/office/drawing/2015/9/8/chartex" xmlns:cx2="http://schemas.microsoft.com/office/drawing/2015/10/21/chartex" xmlns:cx3="http://schemas.microsoft.com/office/drawing/2016/5/9/chartex" xmlns:cx4="http://schemas.microsoft.com/office/drawing/2016/5/10/chartex" xmlns:cx5="http://schemas.microsoft.com/office/drawing/2016/5/11/chartex" xmlns:cx6="http://schemas.microsoft.com/office/drawing/2016/5/12/chartex" xmlns:cx7="http://schemas.microsoft.com/office/drawing/2016/5/13/chartex" xmlns:cx8="http://schemas.microsoft.com/office/drawing/2016/5/14/chartex" xmlns:mc="http://schemas.openxmlformats.org/markup-compatibility/2006" xmlns:aink="http://schemas.microsoft.com/office/drawing/2016/ink" xmlns:am3d="http://schemas.microsoft.com/office/drawing/2017/model3d" xmlns:o="urn:schemas-microsoft-com:office:office" xmlns:oel="http://schemas.microsoft.com/office/2019/extlst" xmlns:r="http://schemas.openxmlformats.org/officeDocument/2006/relationships" xmlns:m="http://schemas.openxmlformats.org/officeDocument/2006/math" xmlns:v="urn:schemas-microsoft-com:vml" xmlns:wp14="http://schemas.microsoft.com/office/word/2010/wordprocessingDrawing" xmlns:wp="http://schemas.openxmlformats.org/drawingml/2006/wordprocessingDrawing" xmlns:w10="urn:schemas-microsoft-com:office:word" xmlns:w="http://schemas.openxmlformats.org/wordprocessingml/2006/main" xmlns:w14="http://schemas.microsoft.com/office/word/2010/wordml" xmlns:w15="http://schemas.microsoft.com/office/word/2012/wordml" xmlns:w16cei="http://schemas.microsoft.com/office/word/2026/wordml/cei" xmlns:w16cex="http://schemas.microsoft.com/office/word/2018/wordml/cex" xmlns:w16cid="http://schemas.microsoft.com/office/word/2016/wordml/cid" xmlns:w16="http://schemas.microsoft.com/office/word/2018/wordml" xmlns:w16du="http://schemas.microsoft.com/office/word/2023/wordml/word16du" xmlns:w16sdtdh="http://schemas.microsoft.com/office/word/2020/wordml/sdtdatahash" xmlns:w16sdtfl="http://schemas.microsoft.com/office/word/2024/wordml/sdtformatlock" xmlns:w16se="http://schemas.microsoft.com/office/word/2015/wordml/symex" xmlns:wpg="http://schemas.microsoft.com/office/word/2010/wordprocessingGroup" xmlns:wpi="http://schemas.microsoft.com/office/word/2010/wordprocessingInk" xmlns:wne="http://schemas.microsoft.com/office/word/2006/wordml" xmlns:wps="http://schemas.microsoft.com/office/word/2010/wordprocessingShape" mc:Ignorable="w14 w15 w16se w16cid w16 w16cex w16sdtdh w16sdtfl w16du wp14">
   <w:p>
     <w:pPr>
       <w:pStyle w:val="Header"/>
@@ -7013,7 +6295,7 @@
 </file>
 
 <file path=word/numbering.xml><?xml version="1.0" encoding="utf-8"?>
-<w:numbering xmlns:wpc="http://schemas.microsoft.com/office/word/2010/wordprocessingCanvas" xmlns:cx="http://schemas.microsoft.com/office/drawing/2014/chartex" xmlns:cx1="http://schemas.microsoft.com/office/drawing/2015/9/8/chartex" xmlns:cx2="http://schemas.microsoft.com/office/drawing/2015/10/21/chartex" xmlns:cx3="http://schemas.microsoft.com/office/drawing/2016/5/9/chartex" xmlns:cx4="http://schemas.microsoft.com/office/drawing/2016/5/10/chartex" xmlns:cx5="http://schemas.microsoft.com/office/drawing/2016/5/11/chartex" xmlns:cx6="http://schemas.microsoft.com/office/drawing/2016/5/12/chartex" xmlns:cx7="http://schemas.microsoft.com/office/drawing/2016/5/13/chartex" xmlns:cx8="http://schemas.microsoft.com/office/drawing/2016/5/14/chartex" xmlns:mc="http://schemas.openxmlformats.org/markup-compatibility/2006" xmlns:aink="http://schemas.microsoft.com/office/drawing/2016/ink" xmlns:am3d="http://schemas.microsoft.com/office/drawing/2017/model3d" xmlns:o="urn:schemas-microsoft-com:office:office" xmlns:oel="http://schemas.microsoft.com/office/2019/extlst" xmlns:r="http://schemas.openxmlformats.org/officeDocument/2006/relationships" xmlns:m="http://schemas.openxmlformats.org/officeDocument/2006/math" xmlns:v="urn:schemas-microsoft-com:vml" xmlns:wp14="http://schemas.microsoft.com/office/word/2010/wordprocessingDrawing" xmlns:wp="http://schemas.openxmlformats.org/drawingml/2006/wordprocessingDrawing" xmlns:w10="urn:schemas-microsoft-com:office:word" xmlns:w="http://schemas.openxmlformats.org/wordprocessingml/2006/main" xmlns:w14="http://schemas.microsoft.com/office/word/2010/wordml" xmlns:w15="http://schemas.microsoft.com/office/word/2012/wordml" xmlns:w16cex="http://schemas.microsoft.com/office/word/2018/wordml/cex" xmlns:w16cid="http://schemas.microsoft.com/office/word/2016/wordml/cid" xmlns:w16="http://schemas.microsoft.com/office/word/2018/wordml" xmlns:w16du="http://schemas.microsoft.com/office/word/2023/wordml/word16du" xmlns:w16sdtdh="http://schemas.microsoft.com/office/word/2020/wordml/sdtdatahash" xmlns:w16sdtfl="http://schemas.microsoft.com/office/word/2024/wordml/sdtformatlock" xmlns:w16se="http://schemas.microsoft.com/office/word/2015/wordml/symex" xmlns:wpg="http://schemas.microsoft.com/office/word/2010/wordprocessingGroup" xmlns:wpi="http://schemas.microsoft.com/office/word/2010/wordprocessingInk" xmlns:wne="http://schemas.microsoft.com/office/word/2006/wordml" xmlns:wps="http://schemas.microsoft.com/office/word/2010/wordprocessingShape" mc:Ignorable="w14 w15 w16se w16cid w16 w16cex w16sdtdh w16sdtfl w16du wp14">
+<w:numbering xmlns:wpc="http://schemas.microsoft.com/office/word/2010/wordprocessingCanvas" xmlns:cx="http://schemas.microsoft.com/office/drawing/2014/chartex" xmlns:cx1="http://schemas.microsoft.com/office/drawing/2015/9/8/chartex" xmlns:cx2="http://schemas.microsoft.com/office/drawing/2015/10/21/chartex" xmlns:cx3="http://schemas.microsoft.com/office/drawing/2016/5/9/chartex" xmlns:cx4="http://schemas.microsoft.com/office/drawing/2016/5/10/chartex" xmlns:cx5="http://schemas.microsoft.com/office/drawing/2016/5/11/chartex" xmlns:cx6="http://schemas.microsoft.com/office/drawing/2016/5/12/chartex" xmlns:cx7="http://schemas.microsoft.com/office/drawing/2016/5/13/chartex" xmlns:cx8="http://schemas.microsoft.com/office/drawing/2016/5/14/chartex" xmlns:mc="http://schemas.openxmlformats.org/markup-compatibility/2006" xmlns:aink="http://schemas.microsoft.com/office/drawing/2016/ink" xmlns:am3d="http://schemas.microsoft.com/office/drawing/2017/model3d" xmlns:o="urn:schemas-microsoft-com:office:office" xmlns:oel="http://schemas.microsoft.com/office/2019/extlst" xmlns:r="http://schemas.openxmlformats.org/officeDocument/2006/relationships" xmlns:m="http://schemas.openxmlformats.org/officeDocument/2006/math" xmlns:v="urn:schemas-microsoft-com:vml" xmlns:wp14="http://schemas.microsoft.com/office/word/2010/wordprocessingDrawing" xmlns:wp="http://schemas.openxmlformats.org/drawingml/2006/wordprocessingDrawing" xmlns:w10="urn:schemas-microsoft-com:office:word" xmlns:w="http://schemas.openxmlformats.org/wordprocessingml/2006/main" xmlns:w14="http://schemas.microsoft.com/office/word/2010/wordml" xmlns:w15="http://schemas.microsoft.com/office/word/2012/wordml" xmlns:w16cei="http://schemas.microsoft.com/office/word/2026/wordml/cei" xmlns:w16cex="http://schemas.microsoft.com/office/word/2018/wordml/cex" xmlns:w16cid="http://schemas.microsoft.com/office/word/2016/wordml/cid" xmlns:w16="http://schemas.microsoft.com/office/word/2018/wordml" xmlns:w16du="http://schemas.microsoft.com/office/word/2023/wordml/word16du" xmlns:w16sdtdh="http://schemas.microsoft.com/office/word/2020/wordml/sdtdatahash" xmlns:w16sdtfl="http://schemas.microsoft.com/office/word/2024/wordml/sdtformatlock" xmlns:w16se="http://schemas.microsoft.com/office/word/2015/wordml/symex" xmlns:wpg="http://schemas.microsoft.com/office/word/2010/wordprocessingGroup" xmlns:wpi="http://schemas.microsoft.com/office/word/2010/wordprocessingInk" xmlns:wne="http://schemas.microsoft.com/office/word/2006/wordml" xmlns:wps="http://schemas.microsoft.com/office/word/2010/wordprocessingShape" mc:Ignorable="w14 w15 w16se w16cid w16 w16cex w16sdtdh w16sdtfl w16du wp14">
   <w:abstractNum w:abstractNumId="0" w15:restartNumberingAfterBreak="0">
     <w:nsid w:val="01A675EC"/>
     <w:multiLevelType w:val="hybridMultilevel"/>
@@ -9973,6 +9255,7 @@
   <w:style w:type="character" w:default="1" w:styleId="DefaultParagraphFont">
     <w:name w:val="Default Paragraph Font"/>
     <w:uiPriority w:val="1"/>
+    <w:semiHidden/>
     <w:unhideWhenUsed/>
   </w:style>
   <w:style w:type="table" w:default="1" w:styleId="TableNormal">

</xml_diff>